<commit_message>
Screenshots of a purchase letter of credit request (docs/59 section 4)
The screenshot journey adds a purchasing officer who creates a purchase LC request on
the screen and enters its terms and documents; the terms show the UCP 600 references
and the transhipment warning. The section lists what the pictures show is still in
English: the list values on the terms screen and the Arabic print's headings and values.

Co-Authored-By: Claude Opus 5.5 <noreply@anthropic.com>
Claude-Session: https://claude.ai/code/session_012HHcRrzuvMBTL2FYxXtsyv
</commit_message>
<xml_diff>
--- a/treasury-platform/docs/59-SYSTEM-SCREENS.docx
+++ b/treasury-platform/docs/59-SYSTEM-SCREENS.docx
@@ -83,6 +83,27 @@
             <w:rtl/>
           </w:rPr>
           <w:t xml:space="preserve">3. التسهيلات من حساب مسؤول التسهيلات</w:t>
+        </w:r>
+      </w:hyperlink>
+    </w:p>
+    <w:p>
+      <w:pPr>
+        <w:bidi/>
+        <w:spacing w:after="50" w:before="0"/>
+        <w:ind w:left="0"/>
+      </w:pPr>
+      <w:hyperlink w:history="1" w:anchor="_sec26">
+        <w:r>
+          <w:rPr>
+            <w:rFonts w:ascii="Arial" w:cs="Arial" w:eastAsia="Arial" w:hAnsi="Arial"/>
+            <w:b/>
+            <w:bCs/>
+            <w:color w:val="1F3A5F"/>
+            <w:sz w:val="20"/>
+            <w:szCs w:val="20"/>
+            <w:rtl/>
+          </w:rPr>
+          <w:t xml:space="preserve">4. طلب اعتماد مستندي للمشتريات</w:t>
         </w:r>
       </w:hyperlink>
     </w:p>
@@ -3120,6 +3141,1222 @@
         </w:rPr>
         <w:t xml:space="preserve">الإخلالات</w:t>
       </w:r>
+    </w:p>
+    <w:p>
+      <w:pPr>
+        <w:pStyle w:val="Heading1"/>
+        <w:bidi/>
+      </w:pPr>
+      <w:bookmarkStart w:name="_sec26" w:id="26"/>
+      <w:r>
+        <w:rPr>
+          <w:rFonts w:ascii="Arial" w:cs="Arial" w:eastAsia="Arial" w:hAnsi="Arial"/>
+          <w:b/>
+          <w:bCs/>
+          <w:color w:val="1F3A5F"/>
+          <w:sz w:val="32"/>
+          <w:szCs w:val="32"/>
+          <w:rtl/>
+        </w:rPr>
+        <w:t xml:space="preserve">4. طلب اعتماد مستندي للمشتريات</w:t>
+      </w:r>
+      <w:bookmarkEnd w:id="26"/>
+    </w:p>
+    <w:p>
+      <w:pPr>
+        <w:bidi/>
+        <w:spacing w:after="110" w:before="0" w:line="312"/>
+      </w:pPr>
+      <w:r>
+        <w:rPr>
+          <w:rFonts w:ascii="Arial" w:cs="Arial" w:eastAsia="Arial" w:hAnsi="Arial"/>
+          <w:b w:val="false"/>
+          <w:bCs w:val="false"/>
+          <w:sz w:val="21"/>
+          <w:szCs w:val="21"/>
+          <w:rtl/>
+        </w:rPr>
+        <w:t xml:space="preserve">طلب المالك: «اعطني صور شاشات طلبات الاعتماد المستندي». فأُضيفت إلى رحلة اللقطات خطوات أخرى:</w:t>
+      </w:r>
+    </w:p>
+    <w:p>
+      <w:pPr>
+        <w:pStyle w:val="ListParagraph"/>
+        <w:numPr>
+          <w:ilvl w:val="0"/>
+          <w:numId w:val="4"/>
+        </w:numPr>
+        <w:bidi/>
+        <w:spacing w:after="70" w:before="0" w:line="300"/>
+      </w:pPr>
+      <w:r>
+        <w:rPr>
+          <w:rFonts w:ascii="Arial" w:cs="Arial" w:eastAsia="Arial" w:hAnsi="Arial"/>
+          <w:b w:val="false"/>
+          <w:bCs w:val="false"/>
+          <w:sz w:val="21"/>
+          <w:szCs w:val="21"/>
+          <w:rtl/>
+        </w:rPr>
+        <w:t xml:space="preserve">مدير المشترك يدعو </w:t>
+      </w:r>
+      <w:r>
+        <w:rPr>
+          <w:rFonts w:ascii="Arial" w:cs="Arial" w:eastAsia="Arial" w:hAnsi="Arial"/>
+          <w:b/>
+          <w:bCs/>
+          <w:sz w:val="21"/>
+          <w:szCs w:val="21"/>
+          <w:rtl/>
+        </w:rPr>
+        <w:t xml:space="preserve">مسؤول مشتريات</w:t>
+      </w:r>
+      <w:r>
+        <w:rPr>
+          <w:rFonts w:ascii="Arial" w:cs="Arial" w:eastAsia="Arial" w:hAnsi="Arial"/>
+          <w:b w:val="false"/>
+          <w:bCs w:val="false"/>
+          <w:sz w:val="21"/>
+          <w:szCs w:val="21"/>
+          <w:rtl/>
+        </w:rPr>
+        <w:t xml:space="preserve"> بدور «الجهة الطالبة».</w:t>
+      </w:r>
+    </w:p>
+    <w:p>
+      <w:pPr>
+        <w:pStyle w:val="ListParagraph"/>
+        <w:numPr>
+          <w:ilvl w:val="0"/>
+          <w:numId w:val="4"/>
+        </w:numPr>
+        <w:bidi/>
+        <w:spacing w:after="70" w:before="0" w:line="300"/>
+      </w:pPr>
+      <w:r>
+        <w:rPr>
+          <w:rFonts w:ascii="Arial" w:cs="Arial" w:eastAsia="Arial" w:hAnsi="Arial"/>
+          <w:b w:val="false"/>
+          <w:bCs w:val="false"/>
+          <w:sz w:val="21"/>
+          <w:szCs w:val="21"/>
+          <w:rtl/>
+        </w:rPr>
+        <w:t xml:space="preserve">مسؤول المشتريات ينشئ الطلب من الشاشة.</w:t>
+      </w:r>
+    </w:p>
+    <w:p>
+      <w:pPr>
+        <w:pStyle w:val="ListParagraph"/>
+        <w:numPr>
+          <w:ilvl w:val="0"/>
+          <w:numId w:val="4"/>
+        </w:numPr>
+        <w:bidi/>
+        <w:spacing w:after="70" w:before="0" w:line="300"/>
+      </w:pPr>
+      <w:r>
+        <w:rPr>
+          <w:rFonts w:ascii="Arial" w:cs="Arial" w:eastAsia="Arial" w:hAnsi="Arial"/>
+          <w:b w:val="false"/>
+          <w:bCs w:val="false"/>
+          <w:sz w:val="21"/>
+          <w:szCs w:val="21"/>
+          <w:rtl/>
+        </w:rPr>
+        <w:t xml:space="preserve">يُدخل شروط الاعتماد ومستنداته، عبر الواجهة البرمجية التي تستعملها الشاشة نفسها، لتقصير الرحلة:</w:t>
+      </w:r>
+    </w:p>
+    <w:p>
+      <w:pPr>
+        <w:pStyle w:val="ListParagraph"/>
+        <w:numPr>
+          <w:ilvl w:val="1"/>
+          <w:numId w:val="2"/>
+        </w:numPr>
+        <w:bidi/>
+        <w:spacing w:after="70" w:before="0" w:line="300"/>
+      </w:pPr>
+      <w:r>
+        <w:rPr>
+          <w:rFonts w:ascii="Arial" w:cs="Arial" w:eastAsia="Arial" w:hAnsi="Arial"/>
+          <w:b w:val="false"/>
+          <w:bCs w:val="false"/>
+          <w:sz w:val="21"/>
+          <w:szCs w:val="21"/>
+          <w:rtl/>
+        </w:rPr>
+        <w:t xml:space="preserve">اعتماد اطلاع بمليون ونصف ريال، وتفاوت 5%.</w:t>
+      </w:r>
+    </w:p>
+    <w:p>
+      <w:pPr>
+        <w:pStyle w:val="ListParagraph"/>
+        <w:numPr>
+          <w:ilvl w:val="1"/>
+          <w:numId w:val="2"/>
+        </w:numPr>
+        <w:bidi/>
+        <w:spacing w:after="70" w:before="0" w:line="300"/>
+      </w:pPr>
+      <w:r>
+        <w:rPr>
+          <w:rFonts w:ascii="Arial" w:cs="Arial" w:eastAsia="Arial" w:hAnsi="Arial"/>
+          <w:b w:val="false"/>
+          <w:bCs w:val="false"/>
+          <w:sz w:val="21"/>
+          <w:szCs w:val="21"/>
+          <w:rtl/>
+        </w:rPr>
+        <w:t xml:space="preserve">شحن بحري من شنغهاي إلى الدمام، بشرط CFR.</w:t>
+      </w:r>
+    </w:p>
+    <w:p>
+      <w:pPr>
+        <w:pStyle w:val="ListParagraph"/>
+        <w:numPr>
+          <w:ilvl w:val="1"/>
+          <w:numId w:val="2"/>
+        </w:numPr>
+        <w:bidi/>
+        <w:spacing w:after="70" w:before="0" w:line="300"/>
+      </w:pPr>
+      <w:r>
+        <w:rPr>
+          <w:rFonts w:ascii="Arial" w:cs="Arial" w:eastAsia="Arial" w:hAnsi="Arial"/>
+          <w:b/>
+          <w:bCs/>
+          <w:sz w:val="21"/>
+          <w:szCs w:val="21"/>
+          <w:rtl/>
+        </w:rPr>
+        <w:t xml:space="preserve">إعادة الشحن ممنوعة</w:t>
+      </w:r>
+      <w:r>
+        <w:rPr>
+          <w:rFonts w:ascii="Arial" w:cs="Arial" w:eastAsia="Arial" w:hAnsi="Arial"/>
+          <w:b w:val="false"/>
+          <w:bCs w:val="false"/>
+          <w:sz w:val="21"/>
+          <w:szCs w:val="21"/>
+          <w:rtl/>
+        </w:rPr>
+        <w:t xml:space="preserve">، فيظهر تحذير المواد 19 إلى 24 من UCP 600.</w:t>
+      </w:r>
+    </w:p>
+    <w:p>
+      <w:pPr>
+        <w:pStyle w:val="ListParagraph"/>
+        <w:numPr>
+          <w:ilvl w:val="1"/>
+          <w:numId w:val="2"/>
+        </w:numPr>
+        <w:bidi/>
+        <w:spacing w:after="70" w:before="0" w:line="300"/>
+      </w:pPr>
+      <w:r>
+        <w:rPr>
+          <w:rFonts w:ascii="Arial" w:cs="Arial" w:eastAsia="Arial" w:hAnsi="Arial"/>
+          <w:b w:val="false"/>
+          <w:bCs w:val="false"/>
+          <w:sz w:val="21"/>
+          <w:szCs w:val="21"/>
+          <w:rtl/>
+        </w:rPr>
+        <w:t xml:space="preserve">ثلاثة مستندات: الفاتورة التجارية، وبوليصة الشحن البحري، وقائمة التعبئة.</w:t>
+      </w:r>
+    </w:p>
+    <w:p>
+      <w:pPr>
+        <w:bidi/>
+        <w:spacing w:after="60" w:before="0"/>
+      </w:pPr>
+    </w:p>
+    <w:p>
+      <w:pPr>
+        <w:pStyle w:val="Heading2"/>
+        <w:bidi/>
+      </w:pPr>
+      <w:bookmarkStart w:name="_sec27" w:id="27"/>
+      <w:r>
+        <w:rPr>
+          <w:rFonts w:ascii="Arial" w:cs="Arial" w:eastAsia="Arial" w:hAnsi="Arial"/>
+          <w:b/>
+          <w:bCs/>
+          <w:color w:val="2B5C8A"/>
+          <w:sz w:val="26"/>
+          <w:szCs w:val="26"/>
+          <w:rtl/>
+        </w:rPr>
+        <w:t xml:space="preserve">طلب جديد</w:t>
+      </w:r>
+      <w:bookmarkEnd w:id="27"/>
+    </w:p>
+    <w:p>
+      <w:pPr>
+        <w:keepNext/>
+        <w:bidi/>
+        <w:spacing w:after="60" w:before="160"/>
+        <w:jc w:val="center"/>
+      </w:pPr>
+      <w:r>
+        <w:drawing>
+          <wp:inline distT="0" distB="0" distL="0" distR="0">
+            <wp:extent cx="6096000" cy="3810000"/>
+            <wp:effectExtent t="0" r="0" b="0" l="0"/>
+            <wp:docPr id="1" name="diagrams/screens/50-request-new.png" descr="طلب جديد: نوع الطلب والشركة والعنوان" title="طلب جديد: نوع الطلب والشركة والعنوان"/>
+            <wp:cNvGraphicFramePr>
+              <a:graphicFrameLocks xmlns:a="http://schemas.openxmlformats.org/drawingml/2006/main" noChangeAspect="1"/>
+            </wp:cNvGraphicFramePr>
+            <a:graphic xmlns:a="http://schemas.openxmlformats.org/drawingml/2006/main">
+              <a:graphicData uri="http://schemas.openxmlformats.org/drawingml/2006/picture">
+                <pic:pic xmlns:pic="http://schemas.openxmlformats.org/drawingml/2006/picture">
+                  <pic:nvPicPr>
+                    <pic:cNvPr id="0" name="" descr=""/>
+                    <pic:cNvPicPr>
+                      <a:picLocks noChangeAspect="1" noChangeArrowheads="1"/>
+                    </pic:cNvPicPr>
+                  </pic:nvPicPr>
+                  <pic:blipFill>
+                    <a:blip r:embed="rId33" cstate="none"/>
+                    <a:srcRect/>
+                    <a:stretch>
+                      <a:fillRect/>
+                    </a:stretch>
+                  </pic:blipFill>
+                  <pic:spPr bwMode="auto">
+                    <a:xfrm>
+                      <a:off x="0" y="0"/>
+                      <a:ext cx="6096000" cy="3810000"/>
+                    </a:xfrm>
+                    <a:prstGeom prst="rect">
+                      <a:avLst/>
+                    </a:prstGeom>
+                  </pic:spPr>
+                </pic:pic>
+              </a:graphicData>
+            </a:graphic>
+          </wp:inline>
+        </w:drawing>
+      </w:r>
+    </w:p>
+    <w:p>
+      <w:pPr>
+        <w:bidi/>
+        <w:spacing w:after="220" w:before="0"/>
+        <w:jc w:val="center"/>
+      </w:pPr>
+      <w:r>
+        <w:rPr>
+          <w:rFonts w:ascii="Arial" w:cs="Arial" w:eastAsia="Arial" w:hAnsi="Arial"/>
+          <w:b w:val="false"/>
+          <w:bCs w:val="false"/>
+          <w:i/>
+          <w:iCs/>
+          <w:color w:val="5B6670"/>
+          <w:sz w:val="17"/>
+          <w:szCs w:val="17"/>
+          <w:rtl/>
+        </w:rPr>
+        <w:t xml:space="preserve">طلب جديد: نوع الطلب والشركة والعنوان</w:t>
+      </w:r>
+    </w:p>
+    <w:p>
+      <w:pPr>
+        <w:pStyle w:val="Heading2"/>
+        <w:bidi/>
+      </w:pPr>
+      <w:bookmarkStart w:name="_sec28" w:id="28"/>
+      <w:r>
+        <w:rPr>
+          <w:rFonts w:ascii="Arial" w:cs="Arial" w:eastAsia="Arial" w:hAnsi="Arial"/>
+          <w:b/>
+          <w:bCs/>
+          <w:color w:val="2B5C8A"/>
+          <w:sz w:val="26"/>
+          <w:szCs w:val="26"/>
+          <w:rtl/>
+        </w:rPr>
+        <w:t xml:space="preserve">بطاقة الطلب</w:t>
+      </w:r>
+      <w:bookmarkEnd w:id="28"/>
+    </w:p>
+    <w:p>
+      <w:pPr>
+        <w:bidi/>
+        <w:spacing w:after="110" w:before="0" w:line="312"/>
+      </w:pPr>
+      <w:r>
+        <w:rPr>
+          <w:rFonts w:ascii="Arial" w:cs="Arial" w:eastAsia="Arial" w:hAnsi="Arial"/>
+          <w:b w:val="false"/>
+          <w:bCs w:val="false"/>
+          <w:sz w:val="21"/>
+          <w:szCs w:val="21"/>
+          <w:rtl/>
+        </w:rPr>
+        <w:t xml:space="preserve">الطلب مسودة، ومنه رابط «شروط الاعتماد المستندي».</w:t>
+      </w:r>
+    </w:p>
+    <w:p>
+      <w:pPr>
+        <w:keepNext/>
+        <w:bidi/>
+        <w:spacing w:after="60" w:before="160"/>
+        <w:jc w:val="center"/>
+      </w:pPr>
+      <w:r>
+        <w:drawing>
+          <wp:inline distT="0" distB="0" distL="0" distR="0">
+            <wp:extent cx="6096000" cy="3810000"/>
+            <wp:effectExtent t="0" r="0" b="0" l="0"/>
+            <wp:docPr id="1" name="diagrams/screens/51-request-card.png" descr="بطاقة طلب الاعتماد المستندي" title="بطاقة طلب الاعتماد المستندي"/>
+            <wp:cNvGraphicFramePr>
+              <a:graphicFrameLocks xmlns:a="http://schemas.openxmlformats.org/drawingml/2006/main" noChangeAspect="1"/>
+            </wp:cNvGraphicFramePr>
+            <a:graphic xmlns:a="http://schemas.openxmlformats.org/drawingml/2006/main">
+              <a:graphicData uri="http://schemas.openxmlformats.org/drawingml/2006/picture">
+                <pic:pic xmlns:pic="http://schemas.openxmlformats.org/drawingml/2006/picture">
+                  <pic:nvPicPr>
+                    <pic:cNvPr id="0" name="" descr=""/>
+                    <pic:cNvPicPr>
+                      <a:picLocks noChangeAspect="1" noChangeArrowheads="1"/>
+                    </pic:cNvPicPr>
+                  </pic:nvPicPr>
+                  <pic:blipFill>
+                    <a:blip r:embed="rId34" cstate="none"/>
+                    <a:srcRect/>
+                    <a:stretch>
+                      <a:fillRect/>
+                    </a:stretch>
+                  </pic:blipFill>
+                  <pic:spPr bwMode="auto">
+                    <a:xfrm>
+                      <a:off x="0" y="0"/>
+                      <a:ext cx="6096000" cy="3810000"/>
+                    </a:xfrm>
+                    <a:prstGeom prst="rect">
+                      <a:avLst/>
+                    </a:prstGeom>
+                  </pic:spPr>
+                </pic:pic>
+              </a:graphicData>
+            </a:graphic>
+          </wp:inline>
+        </w:drawing>
+      </w:r>
+    </w:p>
+    <w:p>
+      <w:pPr>
+        <w:bidi/>
+        <w:spacing w:after="220" w:before="0"/>
+        <w:jc w:val="center"/>
+      </w:pPr>
+      <w:r>
+        <w:rPr>
+          <w:rFonts w:ascii="Arial" w:cs="Arial" w:eastAsia="Arial" w:hAnsi="Arial"/>
+          <w:b w:val="false"/>
+          <w:bCs w:val="false"/>
+          <w:i/>
+          <w:iCs/>
+          <w:color w:val="5B6670"/>
+          <w:sz w:val="17"/>
+          <w:szCs w:val="17"/>
+          <w:rtl/>
+        </w:rPr>
+        <w:t xml:space="preserve">بطاقة طلب الاعتماد المستندي</w:t>
+      </w:r>
+    </w:p>
+    <w:p>
+      <w:pPr>
+        <w:pStyle w:val="Heading2"/>
+        <w:bidi/>
+      </w:pPr>
+      <w:bookmarkStart w:name="_sec29" w:id="29"/>
+      <w:r>
+        <w:rPr>
+          <w:rFonts w:ascii="Arial" w:cs="Arial" w:eastAsia="Arial" w:hAnsi="Arial"/>
+          <w:b/>
+          <w:bCs/>
+          <w:color w:val="2B5C8A"/>
+          <w:sz w:val="26"/>
+          <w:szCs w:val="26"/>
+          <w:rtl/>
+        </w:rPr>
+        <w:t xml:space="preserve">شروط الاعتماد: الفحوص والمستفيد</w:t>
+      </w:r>
+      <w:bookmarkEnd w:id="29"/>
+    </w:p>
+    <w:p>
+      <w:pPr>
+        <w:bidi/>
+        <w:spacing w:after="110" w:before="0" w:line="312"/>
+      </w:pPr>
+      <w:r>
+        <w:rPr>
+          <w:rFonts w:ascii="Arial" w:cs="Arial" w:eastAsia="Arial" w:hAnsi="Arial"/>
+          <w:b w:val="false"/>
+          <w:bCs w:val="false"/>
+          <w:sz w:val="21"/>
+          <w:szCs w:val="21"/>
+          <w:rtl/>
+        </w:rPr>
+        <w:t xml:space="preserve">جدول «الفحوص» يعرض تحذير UCP 600 لإعادة الشحن. وفوقه سطر يشرح المراجع والعلامة *.</w:t>
+      </w:r>
+    </w:p>
+    <w:p>
+      <w:pPr>
+        <w:keepNext/>
+        <w:bidi/>
+        <w:spacing w:after="60" w:before="160"/>
+        <w:jc w:val="center"/>
+      </w:pPr>
+      <w:r>
+        <w:drawing>
+          <wp:inline distT="0" distB="0" distL="0" distR="0">
+            <wp:extent cx="6096000" cy="3810000"/>
+            <wp:effectExtent t="0" r="0" b="0" l="0"/>
+            <wp:docPr id="1" name="diagrams/screens/52-terms.png" descr="شروط الاعتماد: الفحوص والمستفيد" title="شروط الاعتماد: الفحوص والمستفيد"/>
+            <wp:cNvGraphicFramePr>
+              <a:graphicFrameLocks xmlns:a="http://schemas.openxmlformats.org/drawingml/2006/main" noChangeAspect="1"/>
+            </wp:cNvGraphicFramePr>
+            <a:graphic xmlns:a="http://schemas.openxmlformats.org/drawingml/2006/main">
+              <a:graphicData uri="http://schemas.openxmlformats.org/drawingml/2006/picture">
+                <pic:pic xmlns:pic="http://schemas.openxmlformats.org/drawingml/2006/picture">
+                  <pic:nvPicPr>
+                    <pic:cNvPr id="0" name="" descr=""/>
+                    <pic:cNvPicPr>
+                      <a:picLocks noChangeAspect="1" noChangeArrowheads="1"/>
+                    </pic:cNvPicPr>
+                  </pic:nvPicPr>
+                  <pic:blipFill>
+                    <a:blip r:embed="rId35" cstate="none"/>
+                    <a:srcRect/>
+                    <a:stretch>
+                      <a:fillRect/>
+                    </a:stretch>
+                  </pic:blipFill>
+                  <pic:spPr bwMode="auto">
+                    <a:xfrm>
+                      <a:off x="0" y="0"/>
+                      <a:ext cx="6096000" cy="3810000"/>
+                    </a:xfrm>
+                    <a:prstGeom prst="rect">
+                      <a:avLst/>
+                    </a:prstGeom>
+                  </pic:spPr>
+                </pic:pic>
+              </a:graphicData>
+            </a:graphic>
+          </wp:inline>
+        </w:drawing>
+      </w:r>
+    </w:p>
+    <w:p>
+      <w:pPr>
+        <w:bidi/>
+        <w:spacing w:after="220" w:before="0"/>
+        <w:jc w:val="center"/>
+      </w:pPr>
+      <w:r>
+        <w:rPr>
+          <w:rFonts w:ascii="Arial" w:cs="Arial" w:eastAsia="Arial" w:hAnsi="Arial"/>
+          <w:b w:val="false"/>
+          <w:bCs w:val="false"/>
+          <w:i/>
+          <w:iCs/>
+          <w:color w:val="5B6670"/>
+          <w:sz w:val="17"/>
+          <w:szCs w:val="17"/>
+          <w:rtl/>
+        </w:rPr>
+        <w:t xml:space="preserve">شروط الاعتماد: الفحوص والمستفيد</w:t>
+      </w:r>
+    </w:p>
+    <w:p>
+      <w:pPr>
+        <w:pStyle w:val="Heading2"/>
+        <w:bidi/>
+      </w:pPr>
+      <w:bookmarkStart w:name="_sec30" w:id="30"/>
+      <w:r>
+        <w:rPr>
+          <w:rFonts w:ascii="Arial" w:cs="Arial" w:eastAsia="Arial" w:hAnsi="Arial"/>
+          <w:b/>
+          <w:bCs/>
+          <w:color w:val="2B5C8A"/>
+          <w:sz w:val="26"/>
+          <w:szCs w:val="26"/>
+          <w:rtl/>
+        </w:rPr>
+        <w:t xml:space="preserve">حقول الشروط بمراجع UCP 600</w:t>
+      </w:r>
+      <w:bookmarkEnd w:id="30"/>
+    </w:p>
+    <w:p>
+      <w:pPr>
+        <w:bidi/>
+        <w:spacing w:after="110" w:before="0" w:line="312"/>
+      </w:pPr>
+      <w:r>
+        <w:rPr>
+          <w:rFonts w:ascii="Arial" w:cs="Arial" w:eastAsia="Arial" w:hAnsi="Arial"/>
+          <w:b w:val="false"/>
+          <w:bCs w:val="false"/>
+          <w:sz w:val="21"/>
+          <w:szCs w:val="21"/>
+          <w:rtl/>
+        </w:rPr>
+        <w:t xml:space="preserve">تحت كل حقل المواد التي يرجع إليها.</w:t>
+      </w:r>
+    </w:p>
+    <w:p>
+      <w:pPr>
+        <w:keepNext/>
+        <w:bidi/>
+        <w:spacing w:after="60" w:before="160"/>
+        <w:jc w:val="center"/>
+      </w:pPr>
+      <w:r>
+        <w:drawing>
+          <wp:inline distT="0" distB="0" distL="0" distR="0">
+            <wp:extent cx="5876925" cy="8191500"/>
+            <wp:effectExtent t="0" r="0" b="0" l="0"/>
+            <wp:docPr id="1" name="diagrams/screens/53-terms-fields-1.png" descr="حقول الشروط، الجزء الأول" title="حقول الشروط، الجزء الأول"/>
+            <wp:cNvGraphicFramePr>
+              <a:graphicFrameLocks xmlns:a="http://schemas.openxmlformats.org/drawingml/2006/main" noChangeAspect="1"/>
+            </wp:cNvGraphicFramePr>
+            <a:graphic xmlns:a="http://schemas.openxmlformats.org/drawingml/2006/main">
+              <a:graphicData uri="http://schemas.openxmlformats.org/drawingml/2006/picture">
+                <pic:pic xmlns:pic="http://schemas.openxmlformats.org/drawingml/2006/picture">
+                  <pic:nvPicPr>
+                    <pic:cNvPr id="0" name="" descr=""/>
+                    <pic:cNvPicPr>
+                      <a:picLocks noChangeAspect="1" noChangeArrowheads="1"/>
+                    </pic:cNvPicPr>
+                  </pic:nvPicPr>
+                  <pic:blipFill>
+                    <a:blip r:embed="rId36" cstate="none"/>
+                    <a:srcRect/>
+                    <a:stretch>
+                      <a:fillRect/>
+                    </a:stretch>
+                  </pic:blipFill>
+                  <pic:spPr bwMode="auto">
+                    <a:xfrm>
+                      <a:off x="0" y="0"/>
+                      <a:ext cx="5876925" cy="8191500"/>
+                    </a:xfrm>
+                    <a:prstGeom prst="rect">
+                      <a:avLst/>
+                    </a:prstGeom>
+                  </pic:spPr>
+                </pic:pic>
+              </a:graphicData>
+            </a:graphic>
+          </wp:inline>
+        </w:drawing>
+      </w:r>
+    </w:p>
+    <w:p>
+      <w:pPr>
+        <w:bidi/>
+        <w:spacing w:after="220" w:before="0"/>
+        <w:jc w:val="center"/>
+      </w:pPr>
+      <w:r>
+        <w:rPr>
+          <w:rFonts w:ascii="Arial" w:cs="Arial" w:eastAsia="Arial" w:hAnsi="Arial"/>
+          <w:b w:val="false"/>
+          <w:bCs w:val="false"/>
+          <w:i/>
+          <w:iCs/>
+          <w:color w:val="5B6670"/>
+          <w:sz w:val="17"/>
+          <w:szCs w:val="17"/>
+          <w:rtl/>
+        </w:rPr>
+        <w:t xml:space="preserve">حقول الشروط، الجزء الأول</w:t>
+      </w:r>
+    </w:p>
+    <w:p>
+      <w:pPr>
+        <w:keepNext/>
+        <w:bidi/>
+        <w:spacing w:after="60" w:before="160"/>
+        <w:jc w:val="center"/>
+      </w:pPr>
+      <w:r>
+        <w:drawing>
+          <wp:inline distT="0" distB="0" distL="0" distR="0">
+            <wp:extent cx="6057900" cy="8191500"/>
+            <wp:effectExtent t="0" r="0" b="0" l="0"/>
+            <wp:docPr id="1" name="diagrams/screens/53-terms-fields-2.png" descr="حقول الشروط، الجزء الثاني" title="حقول الشروط، الجزء الثاني"/>
+            <wp:cNvGraphicFramePr>
+              <a:graphicFrameLocks xmlns:a="http://schemas.openxmlformats.org/drawingml/2006/main" noChangeAspect="1"/>
+            </wp:cNvGraphicFramePr>
+            <a:graphic xmlns:a="http://schemas.openxmlformats.org/drawingml/2006/main">
+              <a:graphicData uri="http://schemas.openxmlformats.org/drawingml/2006/picture">
+                <pic:pic xmlns:pic="http://schemas.openxmlformats.org/drawingml/2006/picture">
+                  <pic:nvPicPr>
+                    <pic:cNvPr id="0" name="" descr=""/>
+                    <pic:cNvPicPr>
+                      <a:picLocks noChangeAspect="1" noChangeArrowheads="1"/>
+                    </pic:cNvPicPr>
+                  </pic:nvPicPr>
+                  <pic:blipFill>
+                    <a:blip r:embed="rId37" cstate="none"/>
+                    <a:srcRect/>
+                    <a:stretch>
+                      <a:fillRect/>
+                    </a:stretch>
+                  </pic:blipFill>
+                  <pic:spPr bwMode="auto">
+                    <a:xfrm>
+                      <a:off x="0" y="0"/>
+                      <a:ext cx="6057900" cy="8191500"/>
+                    </a:xfrm>
+                    <a:prstGeom prst="rect">
+                      <a:avLst/>
+                    </a:prstGeom>
+                  </pic:spPr>
+                </pic:pic>
+              </a:graphicData>
+            </a:graphic>
+          </wp:inline>
+        </w:drawing>
+      </w:r>
+    </w:p>
+    <w:p>
+      <w:pPr>
+        <w:bidi/>
+        <w:spacing w:after="220" w:before="0"/>
+        <w:jc w:val="center"/>
+      </w:pPr>
+      <w:r>
+        <w:rPr>
+          <w:rFonts w:ascii="Arial" w:cs="Arial" w:eastAsia="Arial" w:hAnsi="Arial"/>
+          <w:b w:val="false"/>
+          <w:bCs w:val="false"/>
+          <w:i/>
+          <w:iCs/>
+          <w:color w:val="5B6670"/>
+          <w:sz w:val="17"/>
+          <w:szCs w:val="17"/>
+          <w:rtl/>
+        </w:rPr>
+        <w:t xml:space="preserve">حقول الشروط، الجزء الثاني</w:t>
+      </w:r>
+    </w:p>
+    <w:p>
+      <w:pPr>
+        <w:pStyle w:val="Heading2"/>
+        <w:bidi/>
+      </w:pPr>
+      <w:bookmarkStart w:name="_sec31" w:id="31"/>
+      <w:r>
+        <w:rPr>
+          <w:rFonts w:ascii="Arial" w:cs="Arial" w:eastAsia="Arial" w:hAnsi="Arial"/>
+          <w:b/>
+          <w:bCs/>
+          <w:color w:val="2B5C8A"/>
+          <w:sz w:val="26"/>
+          <w:szCs w:val="26"/>
+          <w:rtl/>
+        </w:rPr>
+        <w:t xml:space="preserve">المستندات المطلوبة والرسوم</w:t>
+      </w:r>
+      <w:bookmarkEnd w:id="31"/>
+    </w:p>
+    <w:p>
+      <w:pPr>
+        <w:keepNext/>
+        <w:bidi/>
+        <w:spacing w:after="60" w:before="160"/>
+        <w:jc w:val="center"/>
+      </w:pPr>
+      <w:r>
+        <w:drawing>
+          <wp:inline distT="0" distB="0" distL="0" distR="0">
+            <wp:extent cx="6096000" cy="5972175"/>
+            <wp:effectExtent t="0" r="0" b="0" l="0"/>
+            <wp:docPr id="1" name="diagrams/screens/53-terms-documents.png" descr="المستندات المطلوبة والرسوم" title="المستندات المطلوبة والرسوم"/>
+            <wp:cNvGraphicFramePr>
+              <a:graphicFrameLocks xmlns:a="http://schemas.openxmlformats.org/drawingml/2006/main" noChangeAspect="1"/>
+            </wp:cNvGraphicFramePr>
+            <a:graphic xmlns:a="http://schemas.openxmlformats.org/drawingml/2006/main">
+              <a:graphicData uri="http://schemas.openxmlformats.org/drawingml/2006/picture">
+                <pic:pic xmlns:pic="http://schemas.openxmlformats.org/drawingml/2006/picture">
+                  <pic:nvPicPr>
+                    <pic:cNvPr id="0" name="" descr=""/>
+                    <pic:cNvPicPr>
+                      <a:picLocks noChangeAspect="1" noChangeArrowheads="1"/>
+                    </pic:cNvPicPr>
+                  </pic:nvPicPr>
+                  <pic:blipFill>
+                    <a:blip r:embed="rId38" cstate="none"/>
+                    <a:srcRect/>
+                    <a:stretch>
+                      <a:fillRect/>
+                    </a:stretch>
+                  </pic:blipFill>
+                  <pic:spPr bwMode="auto">
+                    <a:xfrm>
+                      <a:off x="0" y="0"/>
+                      <a:ext cx="6096000" cy="5972175"/>
+                    </a:xfrm>
+                    <a:prstGeom prst="rect">
+                      <a:avLst/>
+                    </a:prstGeom>
+                  </pic:spPr>
+                </pic:pic>
+              </a:graphicData>
+            </a:graphic>
+          </wp:inline>
+        </w:drawing>
+      </w:r>
+    </w:p>
+    <w:p>
+      <w:pPr>
+        <w:bidi/>
+        <w:spacing w:after="220" w:before="0"/>
+        <w:jc w:val="center"/>
+      </w:pPr>
+      <w:r>
+        <w:rPr>
+          <w:rFonts w:ascii="Arial" w:cs="Arial" w:eastAsia="Arial" w:hAnsi="Arial"/>
+          <w:b w:val="false"/>
+          <w:bCs w:val="false"/>
+          <w:i/>
+          <w:iCs/>
+          <w:color w:val="5B6670"/>
+          <w:sz w:val="17"/>
+          <w:szCs w:val="17"/>
+          <w:rtl/>
+        </w:rPr>
+        <w:t xml:space="preserve">المستندات المطلوبة والرسوم</w:t>
+      </w:r>
+    </w:p>
+    <w:p>
+      <w:pPr>
+        <w:pStyle w:val="Heading2"/>
+        <w:bidi/>
+      </w:pPr>
+      <w:bookmarkStart w:name="_sec32" w:id="32"/>
+      <w:r>
+        <w:rPr>
+          <w:rFonts w:ascii="Arial" w:cs="Arial" w:eastAsia="Arial" w:hAnsi="Arial"/>
+          <w:b/>
+          <w:bCs/>
+          <w:color w:val="2B5C8A"/>
+          <w:sz w:val="26"/>
+          <w:szCs w:val="26"/>
+          <w:rtl/>
+        </w:rPr>
+        <w:t xml:space="preserve">الشروط المطبوعة</w:t>
+      </w:r>
+      <w:bookmarkEnd w:id="32"/>
+    </w:p>
+    <w:p>
+      <w:pPr>
+        <w:keepNext/>
+        <w:bidi/>
+        <w:spacing w:after="60" w:before="160"/>
+        <w:jc w:val="center"/>
+      </w:pPr>
+      <w:r>
+        <w:drawing>
+          <wp:inline distT="0" distB="0" distL="0" distR="0">
+            <wp:extent cx="6096000" cy="3810000"/>
+            <wp:effectExtent t="0" r="0" b="0" l="0"/>
+            <wp:docPr id="1" name="diagrams/screens/54-terms-print.png" descr="الشروط المطبوعة بالعربية" title="الشروط المطبوعة بالعربية"/>
+            <wp:cNvGraphicFramePr>
+              <a:graphicFrameLocks xmlns:a="http://schemas.openxmlformats.org/drawingml/2006/main" noChangeAspect="1"/>
+            </wp:cNvGraphicFramePr>
+            <a:graphic xmlns:a="http://schemas.openxmlformats.org/drawingml/2006/main">
+              <a:graphicData uri="http://schemas.openxmlformats.org/drawingml/2006/picture">
+                <pic:pic xmlns:pic="http://schemas.openxmlformats.org/drawingml/2006/picture">
+                  <pic:nvPicPr>
+                    <pic:cNvPr id="0" name="" descr=""/>
+                    <pic:cNvPicPr>
+                      <a:picLocks noChangeAspect="1" noChangeArrowheads="1"/>
+                    </pic:cNvPicPr>
+                  </pic:nvPicPr>
+                  <pic:blipFill>
+                    <a:blip r:embed="rId39" cstate="none"/>
+                    <a:srcRect/>
+                    <a:stretch>
+                      <a:fillRect/>
+                    </a:stretch>
+                  </pic:blipFill>
+                  <pic:spPr bwMode="auto">
+                    <a:xfrm>
+                      <a:off x="0" y="0"/>
+                      <a:ext cx="6096000" cy="3810000"/>
+                    </a:xfrm>
+                    <a:prstGeom prst="rect">
+                      <a:avLst/>
+                    </a:prstGeom>
+                  </pic:spPr>
+                </pic:pic>
+              </a:graphicData>
+            </a:graphic>
+          </wp:inline>
+        </w:drawing>
+      </w:r>
+    </w:p>
+    <w:p>
+      <w:pPr>
+        <w:bidi/>
+        <w:spacing w:after="220" w:before="0"/>
+        <w:jc w:val="center"/>
+      </w:pPr>
+      <w:r>
+        <w:rPr>
+          <w:rFonts w:ascii="Arial" w:cs="Arial" w:eastAsia="Arial" w:hAnsi="Arial"/>
+          <w:b w:val="false"/>
+          <w:bCs w:val="false"/>
+          <w:i/>
+          <w:iCs/>
+          <w:color w:val="5B6670"/>
+          <w:sz w:val="17"/>
+          <w:szCs w:val="17"/>
+          <w:rtl/>
+        </w:rPr>
+        <w:t xml:space="preserve">الشروط المطبوعة بالعربية</w:t>
+      </w:r>
+    </w:p>
+    <w:p>
+      <w:pPr>
+        <w:pStyle w:val="Heading2"/>
+        <w:bidi/>
+      </w:pPr>
+      <w:bookmarkStart w:name="_sec33" w:id="33"/>
+      <w:r>
+        <w:rPr>
+          <w:rFonts w:ascii="Arial" w:cs="Arial" w:eastAsia="Arial" w:hAnsi="Arial"/>
+          <w:b/>
+          <w:bCs/>
+          <w:color w:val="2B5C8A"/>
+          <w:sz w:val="26"/>
+          <w:szCs w:val="26"/>
+          <w:rtl/>
+        </w:rPr>
+        <w:t xml:space="preserve">ملاحظات ظهرت في اللقطات</w:t>
+      </w:r>
+      <w:bookmarkEnd w:id="33"/>
+    </w:p>
+    <w:p>
+      <w:pPr>
+        <w:bidi/>
+        <w:spacing w:after="110" w:before="0" w:line="312"/>
+      </w:pPr>
+      <w:r>
+        <w:rPr>
+          <w:rFonts w:ascii="Arial" w:cs="Arial" w:eastAsia="Arial" w:hAnsi="Arial"/>
+          <w:b w:val="false"/>
+          <w:bCs w:val="false"/>
+          <w:sz w:val="21"/>
+          <w:szCs w:val="21"/>
+          <w:rtl/>
+        </w:rPr>
+        <w:t xml:space="preserve">ظهرت في هذه اللقطات أمور تحتاج إصلاحًا، ولم تُصلَح بعد:</w:t>
+      </w:r>
+    </w:p>
+    <w:p>
+      <w:pPr>
+        <w:pStyle w:val="ListParagraph"/>
+        <w:numPr>
+          <w:ilvl w:val="0"/>
+          <w:numId w:val="2"/>
+        </w:numPr>
+        <w:bidi/>
+        <w:spacing w:after="70" w:before="0" w:line="300"/>
+      </w:pPr>
+      <w:r>
+        <w:rPr>
+          <w:rFonts w:ascii="Arial" w:cs="Arial" w:eastAsia="Arial" w:hAnsi="Arial"/>
+          <w:b/>
+          <w:bCs/>
+          <w:sz w:val="21"/>
+          <w:szCs w:val="21"/>
+          <w:rtl/>
+        </w:rPr>
+        <w:t xml:space="preserve">قيم القوائم في شاشة الشروط:</w:t>
+      </w:r>
+      <w:r>
+        <w:rPr>
+          <w:rFonts w:ascii="Arial" w:cs="Arial" w:eastAsia="Arial" w:hAnsi="Arial"/>
+          <w:b w:val="false"/>
+          <w:bCs w:val="false"/>
+          <w:sz w:val="21"/>
+          <w:szCs w:val="21"/>
+          <w:rtl/>
+        </w:rPr>
+        <w:t xml:space="preserve"> تظهر رموزًا إنجليزية بدل أسمائها العربية، مثل </w:t>
+      </w:r>
+      <w:r>
+        <w:rPr>
+          <w:rFonts w:ascii="Courier New" w:cs="Courier New" w:eastAsia="Courier New" w:hAnsi="Courier New"/>
+          <w:b w:val="false"/>
+          <w:bCs w:val="false"/>
+          <w:color w:val="1F2937"/>
+          <w:sz w:val="18"/>
+          <w:szCs w:val="18"/>
+          <w:shd w:fill="F1F3F5" w:color="auto" w:val="clear"/>
+          <w:rtl/>
+        </w:rPr>
+        <w:t xml:space="preserve">‎ALLOWED‎</w:t>
+      </w:r>
+      <w:r>
+        <w:rPr>
+          <w:rFonts w:ascii="Arial" w:cs="Arial" w:eastAsia="Arial" w:hAnsi="Arial"/>
+          <w:b w:val="false"/>
+          <w:bCs w:val="false"/>
+          <w:sz w:val="21"/>
+          <w:szCs w:val="21"/>
+          <w:rtl/>
+        </w:rPr>
+        <w:t xml:space="preserve"> و</w:t>
+      </w:r>
+      <w:r>
+        <w:rPr>
+          <w:rFonts w:ascii="Courier New" w:cs="Courier New" w:eastAsia="Courier New" w:hAnsi="Courier New"/>
+          <w:b w:val="false"/>
+          <w:bCs w:val="false"/>
+          <w:color w:val="1F2937"/>
+          <w:sz w:val="18"/>
+          <w:szCs w:val="18"/>
+          <w:shd w:fill="F1F3F5" w:color="auto" w:val="clear"/>
+          <w:rtl/>
+        </w:rPr>
+        <w:t xml:space="preserve">‎SEA‎</w:t>
+      </w:r>
+      <w:r>
+        <w:rPr>
+          <w:rFonts w:ascii="Arial" w:cs="Arial" w:eastAsia="Arial" w:hAnsi="Arial"/>
+          <w:b w:val="false"/>
+          <w:bCs w:val="false"/>
+          <w:sz w:val="21"/>
+          <w:szCs w:val="21"/>
+          <w:rtl/>
+        </w:rPr>
+        <w:t xml:space="preserve"> و</w:t>
+      </w:r>
+      <w:r>
+        <w:rPr>
+          <w:rFonts w:ascii="Courier New" w:cs="Courier New" w:eastAsia="Courier New" w:hAnsi="Courier New"/>
+          <w:b w:val="false"/>
+          <w:bCs w:val="false"/>
+          <w:color w:val="1F2937"/>
+          <w:sz w:val="18"/>
+          <w:szCs w:val="18"/>
+          <w:shd w:fill="F1F3F5" w:color="auto" w:val="clear"/>
+          <w:rtl/>
+        </w:rPr>
+        <w:t xml:space="preserve">‎ABSOLUTE‎</w:t>
+      </w:r>
+      <w:r>
+        <w:rPr>
+          <w:rFonts w:ascii="Arial" w:cs="Arial" w:eastAsia="Arial" w:hAnsi="Arial"/>
+          <w:b w:val="false"/>
+          <w:bCs w:val="false"/>
+          <w:sz w:val="21"/>
+          <w:szCs w:val="21"/>
+          <w:rtl/>
+        </w:rPr>
+        <w:t xml:space="preserve"> و</w:t>
+      </w:r>
+      <w:r>
+        <w:rPr>
+          <w:rFonts w:ascii="Courier New" w:cs="Courier New" w:eastAsia="Courier New" w:hAnsi="Courier New"/>
+          <w:b w:val="false"/>
+          <w:bCs w:val="false"/>
+          <w:color w:val="1F2937"/>
+          <w:sz w:val="18"/>
+          <w:szCs w:val="18"/>
+          <w:shd w:fill="F1F3F5" w:color="auto" w:val="clear"/>
+          <w:rtl/>
+        </w:rPr>
+        <w:t xml:space="preserve">‎APPLICANT‎</w:t>
+      </w:r>
+      <w:r>
+        <w:rPr>
+          <w:rFonts w:ascii="Arial" w:cs="Arial" w:eastAsia="Arial" w:hAnsi="Arial"/>
+          <w:b w:val="false"/>
+          <w:bCs w:val="false"/>
+          <w:sz w:val="21"/>
+          <w:szCs w:val="21"/>
+          <w:rtl/>
+        </w:rPr>
+        <w:t xml:space="preserve">.</w:t>
+      </w:r>
+    </w:p>
+    <w:p>
+      <w:pPr>
+        <w:pStyle w:val="ListParagraph"/>
+        <w:numPr>
+          <w:ilvl w:val="0"/>
+          <w:numId w:val="2"/>
+        </w:numPr>
+        <w:bidi/>
+        <w:spacing w:after="70" w:before="0" w:line="300"/>
+      </w:pPr>
+      <w:r>
+        <w:rPr>
+          <w:rFonts w:ascii="Arial" w:cs="Arial" w:eastAsia="Arial" w:hAnsi="Arial"/>
+          <w:b/>
+          <w:bCs/>
+          <w:sz w:val="21"/>
+          <w:szCs w:val="21"/>
+          <w:rtl/>
+        </w:rPr>
+        <w:t xml:space="preserve">الشروط المطبوعة بالعربية:</w:t>
+      </w:r>
+    </w:p>
+    <w:p>
+      <w:pPr>
+        <w:pStyle w:val="ListParagraph"/>
+        <w:numPr>
+          <w:ilvl w:val="1"/>
+          <w:numId w:val="2"/>
+        </w:numPr>
+        <w:bidi/>
+        <w:spacing w:after="70" w:before="0" w:line="300"/>
+      </w:pPr>
+      <w:r>
+        <w:rPr>
+          <w:rFonts w:ascii="Arial" w:cs="Arial" w:eastAsia="Arial" w:hAnsi="Arial"/>
+          <w:b w:val="false"/>
+          <w:bCs w:val="false"/>
+          <w:sz w:val="21"/>
+          <w:szCs w:val="21"/>
+          <w:rtl/>
+        </w:rPr>
+        <w:t xml:space="preserve">عناوين الأقسام بالإنجليزية، مثل </w:t>
+      </w:r>
+      <w:r>
+        <w:rPr>
+          <w:rFonts w:ascii="Courier New" w:cs="Courier New" w:eastAsia="Courier New" w:hAnsi="Courier New"/>
+          <w:b w:val="false"/>
+          <w:bCs w:val="false"/>
+          <w:color w:val="1F2937"/>
+          <w:sz w:val="18"/>
+          <w:szCs w:val="18"/>
+          <w:shd w:fill="F1F3F5" w:color="auto" w:val="clear"/>
+          <w:rtl/>
+        </w:rPr>
+        <w:t xml:space="preserve">‎AMOUNT‎</w:t>
+      </w:r>
+      <w:r>
+        <w:rPr>
+          <w:rFonts w:ascii="Arial" w:cs="Arial" w:eastAsia="Arial" w:hAnsi="Arial"/>
+          <w:b w:val="false"/>
+          <w:bCs w:val="false"/>
+          <w:sz w:val="21"/>
+          <w:szCs w:val="21"/>
+          <w:rtl/>
+        </w:rPr>
+        <w:t xml:space="preserve"> و</w:t>
+      </w:r>
+      <w:r>
+        <w:rPr>
+          <w:rFonts w:ascii="Courier New" w:cs="Courier New" w:eastAsia="Courier New" w:hAnsi="Courier New"/>
+          <w:b w:val="false"/>
+          <w:bCs w:val="false"/>
+          <w:color w:val="1F2937"/>
+          <w:sz w:val="18"/>
+          <w:szCs w:val="18"/>
+          <w:shd w:fill="F1F3F5" w:color="auto" w:val="clear"/>
+          <w:rtl/>
+        </w:rPr>
+        <w:t xml:space="preserve">‎DATES‎</w:t>
+      </w:r>
+      <w:r>
+        <w:rPr>
+          <w:rFonts w:ascii="Arial" w:cs="Arial" w:eastAsia="Arial" w:hAnsi="Arial"/>
+          <w:b w:val="false"/>
+          <w:bCs w:val="false"/>
+          <w:sz w:val="21"/>
+          <w:szCs w:val="21"/>
+          <w:rtl/>
+        </w:rPr>
+        <w:t xml:space="preserve">.</w:t>
+      </w:r>
+    </w:p>
+    <w:p>
+      <w:pPr>
+        <w:pStyle w:val="ListParagraph"/>
+        <w:numPr>
+          <w:ilvl w:val="1"/>
+          <w:numId w:val="2"/>
+        </w:numPr>
+        <w:bidi/>
+        <w:spacing w:after="70" w:before="0" w:line="300"/>
+      </w:pPr>
+      <w:r>
+        <w:rPr>
+          <w:rFonts w:ascii="Arial" w:cs="Arial" w:eastAsia="Arial" w:hAnsi="Arial"/>
+          <w:b w:val="false"/>
+          <w:bCs w:val="false"/>
+          <w:sz w:val="21"/>
+          <w:szCs w:val="21"/>
+          <w:rtl/>
+        </w:rPr>
+        <w:t xml:space="preserve">القيم رموز، وحالة الطلب </w:t>
+      </w:r>
+      <w:r>
+        <w:rPr>
+          <w:rFonts w:ascii="Courier New" w:cs="Courier New" w:eastAsia="Courier New" w:hAnsi="Courier New"/>
+          <w:b w:val="false"/>
+          <w:bCs w:val="false"/>
+          <w:color w:val="1F2937"/>
+          <w:sz w:val="18"/>
+          <w:szCs w:val="18"/>
+          <w:shd w:fill="F1F3F5" w:color="auto" w:val="clear"/>
+          <w:rtl/>
+        </w:rPr>
+        <w:t xml:space="preserve">‎DRAFT‎</w:t>
+      </w:r>
+      <w:r>
+        <w:rPr>
+          <w:rFonts w:ascii="Arial" w:cs="Arial" w:eastAsia="Arial" w:hAnsi="Arial"/>
+          <w:b w:val="false"/>
+          <w:bCs w:val="false"/>
+          <w:sz w:val="21"/>
+          <w:szCs w:val="21"/>
+          <w:rtl/>
+        </w:rPr>
+        <w:t xml:space="preserve">.</w:t>
+      </w:r>
+    </w:p>
+    <w:p>
+      <w:pPr>
+        <w:pStyle w:val="ListParagraph"/>
+        <w:numPr>
+          <w:ilvl w:val="1"/>
+          <w:numId w:val="2"/>
+        </w:numPr>
+        <w:bidi/>
+        <w:spacing w:after="70" w:before="0" w:line="300"/>
+      </w:pPr>
+      <w:r>
+        <w:rPr>
+          <w:rFonts w:ascii="Arial" w:cs="Arial" w:eastAsia="Arial" w:hAnsi="Arial"/>
+          <w:b w:val="false"/>
+          <w:bCs w:val="false"/>
+          <w:sz w:val="21"/>
+          <w:szCs w:val="21"/>
+          <w:rtl/>
+        </w:rPr>
+        <w:t xml:space="preserve">الحقل المنطقي غير المُدخَل يظهر بعلامة ×.</w:t>
+      </w:r>
+    </w:p>
+    <w:p>
+      <w:pPr>
+        <w:bidi/>
+        <w:spacing w:after="60" w:before="0"/>
+      </w:pPr>
     </w:p>
     <w:sectPr>
       <w:headerReference w:type="default" r:id="rId7"/>
@@ -3448,6 +4685,36 @@
       </w:pPr>
     </w:lvl>
   </w:abstractNum>
+  <w:abstractNum w:abstractNumId="4" w15:restartNumberingAfterBreak="0">
+    <w:multiLevelType w:val="hybridMultilevel"/>
+    <w:lvl w:ilvl="0" w15:tentative="1">
+      <w:start w:val="1"/>
+      <w:numFmt w:val="decimal"/>
+      <w:lvlText w:val="%1."/>
+      <w:lvlJc w:val="left"/>
+      <w:pPr>
+        <w:ind w:left="574" w:hanging="340"/>
+      </w:pPr>
+    </w:lvl>
+    <w:lvl w:ilvl="1" w15:tentative="1">
+      <w:start w:val="1"/>
+      <w:numFmt w:val="decimal"/>
+      <w:lvlText w:val="%2."/>
+      <w:lvlJc w:val="left"/>
+      <w:pPr>
+        <w:ind w:left="1028" w:hanging="340"/>
+      </w:pPr>
+    </w:lvl>
+    <w:lvl w:ilvl="2" w15:tentative="1">
+      <w:start w:val="1"/>
+      <w:numFmt w:val="decimal"/>
+      <w:lvlText w:val="%3."/>
+      <w:lvlJc w:val="left"/>
+      <w:pPr>
+        <w:ind w:left="1482" w:hanging="340"/>
+      </w:pPr>
+    </w:lvl>
+  </w:abstractNum>
   <w:num w:numId="1">
     <w:abstractNumId w:val="1"/>
     <w:lvlOverride w:ilvl="0">
@@ -3462,6 +4729,12 @@
   </w:num>
   <w:num w:numId="3">
     <w:abstractNumId w:val="3"/>
+    <w:lvlOverride w:ilvl="0">
+      <w:startOverride w:val="1"/>
+    </w:lvlOverride>
+  </w:num>
+  <w:num w:numId="4">
+    <w:abstractNumId w:val="4"/>
     <w:lvlOverride w:ilvl="0">
       <w:startOverride w:val="1"/>
     </w:lvlOverride>

</xml_diff>

<commit_message>
Screenshots of the terms with the SWIFT field codes (docs/59 section 4)
Co-Authored-By: Claude Opus 5.5 <noreply@anthropic.com>
Claude-Session: https://claude.ai/code/session_012HHcRrzuvMBTL2FYxXtsyv
</commit_message>
<xml_diff>
--- a/treasury-platform/docs/59-SYSTEM-SCREENS.docx
+++ b/treasury-platform/docs/59-SYSTEM-SCREENS.docx
@@ -3601,7 +3601,55 @@
           <w:szCs w:val="21"/>
           <w:rtl/>
         </w:rPr>
-        <w:t xml:space="preserve">جدول «الفحوص» يعرض تحذير UCP 600 لإعادة الشحن. وفوقه سطر يشرح المراجع والعلامة *.</w:t>
+        <w:t xml:space="preserve">جدول «الفحوص» يعرض تحذير إعادة الشحن، وبجانب الشرط رمز حقله </w:t>
+      </w:r>
+      <w:r>
+        <w:rPr>
+          <w:rFonts w:ascii="Courier New" w:cs="Courier New" w:eastAsia="Courier New" w:hAnsi="Courier New"/>
+          <w:b w:val="false"/>
+          <w:bCs w:val="false"/>
+          <w:color w:val="1F2937"/>
+          <w:sz w:val="18"/>
+          <w:szCs w:val="18"/>
+          <w:shd w:fill="F1F3F5" w:color="auto" w:val="clear"/>
+          <w:rtl/>
+        </w:rPr>
+        <w:t xml:space="preserve">‎43T‎</w:t>
+      </w:r>
+      <w:r>
+        <w:rPr>
+          <w:rFonts w:ascii="Arial" w:cs="Arial" w:eastAsia="Arial" w:hAnsi="Arial"/>
+          <w:b w:val="false"/>
+          <w:bCs w:val="false"/>
+          <w:sz w:val="21"/>
+          <w:szCs w:val="21"/>
+          <w:rtl/>
+        </w:rPr>
+        <w:t xml:space="preserve">. وعنوان المستفيد يحمل رمزه </w:t>
+      </w:r>
+      <w:r>
+        <w:rPr>
+          <w:rFonts w:ascii="Courier New" w:cs="Courier New" w:eastAsia="Courier New" w:hAnsi="Courier New"/>
+          <w:b w:val="false"/>
+          <w:bCs w:val="false"/>
+          <w:color w:val="1F2937"/>
+          <w:sz w:val="18"/>
+          <w:szCs w:val="18"/>
+          <w:shd w:fill="F1F3F5" w:color="auto" w:val="clear"/>
+          <w:rtl/>
+        </w:rPr>
+        <w:t xml:space="preserve">‎59‎</w:t>
+      </w:r>
+      <w:r>
+        <w:rPr>
+          <w:rFonts w:ascii="Arial" w:cs="Arial" w:eastAsia="Arial" w:hAnsi="Arial"/>
+          <w:b w:val="false"/>
+          <w:bCs w:val="false"/>
+          <w:sz w:val="21"/>
+          <w:szCs w:val="21"/>
+          <w:rtl/>
+        </w:rPr>
+        <w:t xml:space="preserve">.</w:t>
       </w:r>
     </w:p>
     <w:p>
@@ -3689,7 +3737,7 @@
           <w:szCs w:val="26"/>
           <w:rtl/>
         </w:rPr>
-        <w:t xml:space="preserve">حقول الشروط بمراجع UCP 600</w:t>
+        <w:t xml:space="preserve">حقول الشروط برمز حقل سويفت</w:t>
       </w:r>
       <w:bookmarkEnd w:id="30"/>
     </w:p>
@@ -3707,7 +3755,31 @@
           <w:szCs w:val="21"/>
           <w:rtl/>
         </w:rPr>
-        <w:t xml:space="preserve">تحت كل حقل المواد التي يرجع إليها.</w:t>
+        <w:t xml:space="preserve">تحت كل شرط رمز حقله في رسالة MT700 فقط، كما طلب المالك (</w:t>
+      </w:r>
+      <w:r>
+        <w:rPr>
+          <w:rFonts w:ascii="Courier New" w:cs="Courier New" w:eastAsia="Courier New" w:hAnsi="Courier New"/>
+          <w:b w:val="false"/>
+          <w:bCs w:val="false"/>
+          <w:color w:val="1F2937"/>
+          <w:sz w:val="18"/>
+          <w:szCs w:val="18"/>
+          <w:shd w:fill="F1F3F5" w:color="auto" w:val="clear"/>
+          <w:rtl/>
+        </w:rPr>
+        <w:t xml:space="preserve">‎docs/60‎</w:t>
+      </w:r>
+      <w:r>
+        <w:rPr>
+          <w:rFonts w:ascii="Arial" w:cs="Arial" w:eastAsia="Arial" w:hAnsi="Arial"/>
+          <w:b w:val="false"/>
+          <w:bCs w:val="false"/>
+          <w:sz w:val="21"/>
+          <w:szCs w:val="21"/>
+          <w:rtl/>
+        </w:rPr>
+        <w:t xml:space="preserve"> §6). والقيم بالعربية. ولا تظهر أيام التأجيل لأن الاعتماد بالاطلاع.</w:t>
       </w:r>
     </w:p>
     <w:p>
@@ -4048,23 +4120,6 @@
     </w:p>
     <w:p>
       <w:pPr>
-        <w:bidi/>
-        <w:spacing w:after="110" w:before="0" w:line="312"/>
-      </w:pPr>
-      <w:r>
-        <w:rPr>
-          <w:rFonts w:ascii="Arial" w:cs="Arial" w:eastAsia="Arial" w:hAnsi="Arial"/>
-          <w:b w:val="false"/>
-          <w:bCs w:val="false"/>
-          <w:sz w:val="21"/>
-          <w:szCs w:val="21"/>
-          <w:rtl/>
-        </w:rPr>
-        <w:t xml:space="preserve">ظهرت في هذه اللقطات أمور تحتاج إصلاحًا، ولم تُصلَح بعد:</w:t>
-      </w:r>
-    </w:p>
-    <w:p>
-      <w:pPr>
         <w:pStyle w:val="ListParagraph"/>
         <w:numPr>
           <w:ilvl w:val="0"/>
@@ -4093,103 +4148,7 @@
           <w:szCs w:val="21"/>
           <w:rtl/>
         </w:rPr>
-        <w:t xml:space="preserve"> تظهر رموزًا إنجليزية بدل أسمائها العربية، مثل </w:t>
-      </w:r>
-      <w:r>
-        <w:rPr>
-          <w:rFonts w:ascii="Courier New" w:cs="Courier New" w:eastAsia="Courier New" w:hAnsi="Courier New"/>
-          <w:b w:val="false"/>
-          <w:bCs w:val="false"/>
-          <w:color w:val="1F2937"/>
-          <w:sz w:val="18"/>
-          <w:szCs w:val="18"/>
-          <w:shd w:fill="F1F3F5" w:color="auto" w:val="clear"/>
-          <w:rtl/>
-        </w:rPr>
-        <w:t xml:space="preserve">‎ALLOWED‎</w:t>
-      </w:r>
-      <w:r>
-        <w:rPr>
-          <w:rFonts w:ascii="Arial" w:cs="Arial" w:eastAsia="Arial" w:hAnsi="Arial"/>
-          <w:b w:val="false"/>
-          <w:bCs w:val="false"/>
-          <w:sz w:val="21"/>
-          <w:szCs w:val="21"/>
-          <w:rtl/>
-        </w:rPr>
-        <w:t xml:space="preserve"> و</w:t>
-      </w:r>
-      <w:r>
-        <w:rPr>
-          <w:rFonts w:ascii="Courier New" w:cs="Courier New" w:eastAsia="Courier New" w:hAnsi="Courier New"/>
-          <w:b w:val="false"/>
-          <w:bCs w:val="false"/>
-          <w:color w:val="1F2937"/>
-          <w:sz w:val="18"/>
-          <w:szCs w:val="18"/>
-          <w:shd w:fill="F1F3F5" w:color="auto" w:val="clear"/>
-          <w:rtl/>
-        </w:rPr>
-        <w:t xml:space="preserve">‎SEA‎</w:t>
-      </w:r>
-      <w:r>
-        <w:rPr>
-          <w:rFonts w:ascii="Arial" w:cs="Arial" w:eastAsia="Arial" w:hAnsi="Arial"/>
-          <w:b w:val="false"/>
-          <w:bCs w:val="false"/>
-          <w:sz w:val="21"/>
-          <w:szCs w:val="21"/>
-          <w:rtl/>
-        </w:rPr>
-        <w:t xml:space="preserve"> و</w:t>
-      </w:r>
-      <w:r>
-        <w:rPr>
-          <w:rFonts w:ascii="Courier New" w:cs="Courier New" w:eastAsia="Courier New" w:hAnsi="Courier New"/>
-          <w:b w:val="false"/>
-          <w:bCs w:val="false"/>
-          <w:color w:val="1F2937"/>
-          <w:sz w:val="18"/>
-          <w:szCs w:val="18"/>
-          <w:shd w:fill="F1F3F5" w:color="auto" w:val="clear"/>
-          <w:rtl/>
-        </w:rPr>
-        <w:t xml:space="preserve">‎ABSOLUTE‎</w:t>
-      </w:r>
-      <w:r>
-        <w:rPr>
-          <w:rFonts w:ascii="Arial" w:cs="Arial" w:eastAsia="Arial" w:hAnsi="Arial"/>
-          <w:b w:val="false"/>
-          <w:bCs w:val="false"/>
-          <w:sz w:val="21"/>
-          <w:szCs w:val="21"/>
-          <w:rtl/>
-        </w:rPr>
-        <w:t xml:space="preserve"> و</w:t>
-      </w:r>
-      <w:r>
-        <w:rPr>
-          <w:rFonts w:ascii="Courier New" w:cs="Courier New" w:eastAsia="Courier New" w:hAnsi="Courier New"/>
-          <w:b w:val="false"/>
-          <w:bCs w:val="false"/>
-          <w:color w:val="1F2937"/>
-          <w:sz w:val="18"/>
-          <w:szCs w:val="18"/>
-          <w:shd w:fill="F1F3F5" w:color="auto" w:val="clear"/>
-          <w:rtl/>
-        </w:rPr>
-        <w:t xml:space="preserve">‎APPLICANT‎</w:t>
-      </w:r>
-      <w:r>
-        <w:rPr>
-          <w:rFonts w:ascii="Arial" w:cs="Arial" w:eastAsia="Arial" w:hAnsi="Arial"/>
-          <w:b w:val="false"/>
-          <w:bCs w:val="false"/>
-          <w:sz w:val="21"/>
-          <w:szCs w:val="21"/>
-          <w:rtl/>
-        </w:rPr>
-        <w:t xml:space="preserve">.</w:t>
+        <w:t xml:space="preserve"> كانت رموزًا إنجليزية، وصُحّحت فصارت بالعربية.</w:t>
       </w:r>
     </w:p>
     <w:p>
@@ -4212,6 +4171,17 @@
           <w:rtl/>
         </w:rPr>
         <w:t xml:space="preserve">الشروط المطبوعة بالعربية:</w:t>
+      </w:r>
+      <w:r>
+        <w:rPr>
+          <w:rFonts w:ascii="Arial" w:cs="Arial" w:eastAsia="Arial" w:hAnsi="Arial"/>
+          <w:b w:val="false"/>
+          <w:bCs w:val="false"/>
+          <w:sz w:val="21"/>
+          <w:szCs w:val="21"/>
+          <w:rtl/>
+        </w:rPr>
+        <w:t xml:space="preserve"> لم تُصلَح بعد:</w:t>
       </w:r>
     </w:p>
     <w:p>

</xml_diff>

<commit_message>
Screenshots of the terms in English (the default) and Arabic, the goods category by name (docs/59)
Co-Authored-By: Claude Opus 5.5 <noreply@anthropic.com>
Claude-Session: https://claude.ai/code/session_012HHcRrzuvMBTL2FYxXtsyv
</commit_message>
<xml_diff>
--- a/treasury-platform/docs/59-SYSTEM-SCREENS.docx
+++ b/treasury-platform/docs/59-SYSTEM-SCREENS.docx
@@ -3792,7 +3792,7 @@
       <w:r>
         <w:drawing>
           <wp:inline distT="0" distB="0" distL="0" distR="0">
-            <wp:extent cx="5991225" cy="8191500"/>
+            <wp:extent cx="6096000" cy="6981825"/>
             <wp:effectExtent t="0" r="0" b="0" l="0"/>
             <wp:docPr id="1" name="diagrams/screens/53-terms-fields-1.png" descr="حقول الشروط، الجزء الأول" title="حقول الشروط، الجزء الأول"/>
             <wp:cNvGraphicFramePr>
@@ -3817,7 +3817,7 @@
                   <pic:spPr bwMode="auto">
                     <a:xfrm>
                       <a:off x="0" y="0"/>
-                      <a:ext cx="5991225" cy="8191500"/>
+                      <a:ext cx="6096000" cy="6981825"/>
                     </a:xfrm>
                     <a:prstGeom prst="rect">
                       <a:avLst/>
@@ -3861,7 +3861,7 @@
       <w:r>
         <w:drawing>
           <wp:inline distT="0" distB="0" distL="0" distR="0">
-            <wp:extent cx="5991225" cy="8191500"/>
+            <wp:extent cx="6096000" cy="6981825"/>
             <wp:effectExtent t="0" r="0" b="0" l="0"/>
             <wp:docPr id="1" name="diagrams/screens/53-terms-fields-2.png" descr="حقول الشروط، الجزء الثاني" title="حقول الشروط، الجزء الثاني"/>
             <wp:cNvGraphicFramePr>
@@ -3886,7 +3886,7 @@
                   <pic:spPr bwMode="auto">
                     <a:xfrm>
                       <a:off x="0" y="0"/>
-                      <a:ext cx="5991225" cy="8191500"/>
+                      <a:ext cx="6096000" cy="6981825"/>
                     </a:xfrm>
                     <a:prstGeom prst="rect">
                       <a:avLst/>
@@ -3930,7 +3930,7 @@
       <w:r>
         <w:drawing>
           <wp:inline distT="0" distB="0" distL="0" distR="0">
-            <wp:extent cx="5915025" cy="8191500"/>
+            <wp:extent cx="6096000" cy="6981825"/>
             <wp:effectExtent t="0" r="0" b="0" l="0"/>
             <wp:docPr id="1" name="diagrams/screens/53-terms-fields-3.png" descr="حقول الشروط، الجزء الثالث: الشروط الإضافية 47A والتعزيز والبنك المبلِّغ" title="حقول الشروط، الجزء الثالث: الشروط الإضافية 47A والتعزيز والبنك المبلِّغ"/>
             <wp:cNvGraphicFramePr>
@@ -3955,7 +3955,7 @@
                   <pic:spPr bwMode="auto">
                     <a:xfrm>
                       <a:off x="0" y="0"/>
-                      <a:ext cx="5915025" cy="8191500"/>
+                      <a:ext cx="6096000" cy="6981825"/>
                     </a:xfrm>
                     <a:prstGeom prst="rect">
                       <a:avLst/>
@@ -4200,9 +4200,50 @@
           <w:szCs w:val="26"/>
           <w:rtl/>
         </w:rPr>
-        <w:t xml:space="preserve">ملاحظات ظهرت في اللقطات</w:t>
+        <w:t xml:space="preserve">بالإنجليزية، اللغة الافتراضية</w:t>
       </w:r>
       <w:bookmarkEnd w:id="33"/>
+    </w:p>
+    <w:p>
+      <w:pPr>
+        <w:bidi/>
+        <w:spacing w:after="110" w:before="0" w:line="312"/>
+      </w:pPr>
+      <w:r>
+        <w:rPr>
+          <w:rFonts w:ascii="Arial" w:cs="Arial" w:eastAsia="Arial" w:hAnsi="Arial"/>
+          <w:b w:val="false"/>
+          <w:bCs w:val="false"/>
+          <w:sz w:val="21"/>
+          <w:szCs w:val="21"/>
+          <w:rtl/>
+        </w:rPr>
+        <w:t xml:space="preserve">الشاشات تبدأ بالإنجليزية، والعربية خيار ثانٍ (</w:t>
+      </w:r>
+      <w:r>
+        <w:rPr>
+          <w:rFonts w:ascii="Courier New" w:cs="Courier New" w:eastAsia="Courier New" w:hAnsi="Courier New"/>
+          <w:b w:val="false"/>
+          <w:bCs w:val="false"/>
+          <w:color w:val="1F2937"/>
+          <w:sz w:val="18"/>
+          <w:szCs w:val="18"/>
+          <w:shd w:fill="F1F3F5" w:color="auto" w:val="clear"/>
+          <w:rtl/>
+        </w:rPr>
+        <w:t xml:space="preserve">‎docs/31‎</w:t>
+      </w:r>
+      <w:r>
+        <w:rPr>
+          <w:rFonts w:ascii="Arial" w:cs="Arial" w:eastAsia="Arial" w:hAnsi="Arial"/>
+          <w:b w:val="false"/>
+          <w:bCs w:val="false"/>
+          <w:sz w:val="21"/>
+          <w:szCs w:val="21"/>
+          <w:rtl/>
+        </w:rPr>
+        <w:t xml:space="preserve"> الصف 69):</w:t>
+      </w:r>
     </w:p>
     <w:p>
       <w:pPr>
@@ -4217,6 +4258,374 @@
       <w:r>
         <w:rPr>
           <w:rFonts w:ascii="Arial" w:cs="Arial" w:eastAsia="Arial" w:hAnsi="Arial"/>
+          <w:b w:val="false"/>
+          <w:bCs w:val="false"/>
+          <w:sz w:val="21"/>
+          <w:szCs w:val="21"/>
+          <w:rtl/>
+        </w:rPr>
+        <w:t xml:space="preserve">قيم القوائم كلمات إنجليزية.</w:t>
+      </w:r>
+    </w:p>
+    <w:p>
+      <w:pPr>
+        <w:pStyle w:val="ListParagraph"/>
+        <w:numPr>
+          <w:ilvl w:val="0"/>
+          <w:numId w:val="2"/>
+        </w:numPr>
+        <w:bidi/>
+        <w:spacing w:after="70" w:before="0" w:line="300"/>
+      </w:pPr>
+      <w:r>
+        <w:rPr>
+          <w:rFonts w:ascii="Arial" w:cs="Arial" w:eastAsia="Arial" w:hAnsi="Arial"/>
+          <w:b w:val="false"/>
+          <w:bCs w:val="false"/>
+          <w:sz w:val="21"/>
+          <w:szCs w:val="21"/>
+          <w:rtl/>
+        </w:rPr>
+        <w:t xml:space="preserve">تصنيف البضاعة باسمه الإنجليزي من الكتالوج، مثل «Steel and pipes».</w:t>
+      </w:r>
+    </w:p>
+    <w:p>
+      <w:pPr>
+        <w:pStyle w:val="ListParagraph"/>
+        <w:numPr>
+          <w:ilvl w:val="0"/>
+          <w:numId w:val="2"/>
+        </w:numPr>
+        <w:bidi/>
+        <w:spacing w:after="70" w:before="0" w:line="300"/>
+      </w:pPr>
+      <w:r>
+        <w:rPr>
+          <w:rFonts w:ascii="Arial" w:cs="Arial" w:eastAsia="Arial" w:hAnsi="Arial"/>
+          <w:b w:val="false"/>
+          <w:bCs w:val="false"/>
+          <w:sz w:val="21"/>
+          <w:szCs w:val="21"/>
+          <w:rtl/>
+        </w:rPr>
+        <w:t xml:space="preserve">حقول النصوص تقبل اللغتين.</w:t>
+      </w:r>
+    </w:p>
+    <w:p>
+      <w:pPr>
+        <w:bidi/>
+        <w:spacing w:after="60" w:before="0"/>
+      </w:pPr>
+    </w:p>
+    <w:p>
+      <w:pPr>
+        <w:keepNext/>
+        <w:bidi/>
+        <w:spacing w:after="60" w:before="160"/>
+        <w:jc w:val="center"/>
+      </w:pPr>
+      <w:r>
+        <w:drawing>
+          <wp:inline distT="0" distB="0" distL="0" distR="0">
+            <wp:extent cx="6096000" cy="6981825"/>
+            <wp:effectExtent t="0" r="0" b="0" l="0"/>
+            <wp:docPr id="1" name="diagrams/screens/58-terms-en-1.png" descr="شروط الاعتماد بالإنجليزية، الجزء الأول" title="شروط الاعتماد بالإنجليزية، الجزء الأول"/>
+            <wp:cNvGraphicFramePr>
+              <a:graphicFrameLocks xmlns:a="http://schemas.openxmlformats.org/drawingml/2006/main" noChangeAspect="1"/>
+            </wp:cNvGraphicFramePr>
+            <a:graphic xmlns:a="http://schemas.openxmlformats.org/drawingml/2006/main">
+              <a:graphicData uri="http://schemas.openxmlformats.org/drawingml/2006/picture">
+                <pic:pic xmlns:pic="http://schemas.openxmlformats.org/drawingml/2006/picture">
+                  <pic:nvPicPr>
+                    <pic:cNvPr id="0" name="" descr=""/>
+                    <pic:cNvPicPr>
+                      <a:picLocks noChangeAspect="1" noChangeArrowheads="1"/>
+                    </pic:cNvPicPr>
+                  </pic:nvPicPr>
+                  <pic:blipFill>
+                    <a:blip r:embed="rId41" cstate="none"/>
+                    <a:srcRect/>
+                    <a:stretch>
+                      <a:fillRect/>
+                    </a:stretch>
+                  </pic:blipFill>
+                  <pic:spPr bwMode="auto">
+                    <a:xfrm>
+                      <a:off x="0" y="0"/>
+                      <a:ext cx="6096000" cy="6981825"/>
+                    </a:xfrm>
+                    <a:prstGeom prst="rect">
+                      <a:avLst/>
+                    </a:prstGeom>
+                  </pic:spPr>
+                </pic:pic>
+              </a:graphicData>
+            </a:graphic>
+          </wp:inline>
+        </w:drawing>
+      </w:r>
+    </w:p>
+    <w:p>
+      <w:pPr>
+        <w:bidi/>
+        <w:spacing w:after="220" w:before="0"/>
+        <w:jc w:val="center"/>
+      </w:pPr>
+      <w:r>
+        <w:rPr>
+          <w:rFonts w:ascii="Arial" w:cs="Arial" w:eastAsia="Arial" w:hAnsi="Arial"/>
+          <w:b w:val="false"/>
+          <w:bCs w:val="false"/>
+          <w:i/>
+          <w:iCs/>
+          <w:color w:val="5B6670"/>
+          <w:sz w:val="17"/>
+          <w:szCs w:val="17"/>
+          <w:rtl/>
+        </w:rPr>
+        <w:t xml:space="preserve">شروط الاعتماد بالإنجليزية، الجزء الأول</w:t>
+      </w:r>
+    </w:p>
+    <w:p>
+      <w:pPr>
+        <w:keepNext/>
+        <w:bidi/>
+        <w:spacing w:after="60" w:before="160"/>
+        <w:jc w:val="center"/>
+      </w:pPr>
+      <w:r>
+        <w:drawing>
+          <wp:inline distT="0" distB="0" distL="0" distR="0">
+            <wp:extent cx="6096000" cy="6981825"/>
+            <wp:effectExtent t="0" r="0" b="0" l="0"/>
+            <wp:docPr id="1" name="diagrams/screens/58-terms-en-2.png" descr="شروط الاعتماد بالإنجليزية، الجزء الثاني" title="شروط الاعتماد بالإنجليزية، الجزء الثاني"/>
+            <wp:cNvGraphicFramePr>
+              <a:graphicFrameLocks xmlns:a="http://schemas.openxmlformats.org/drawingml/2006/main" noChangeAspect="1"/>
+            </wp:cNvGraphicFramePr>
+            <a:graphic xmlns:a="http://schemas.openxmlformats.org/drawingml/2006/main">
+              <a:graphicData uri="http://schemas.openxmlformats.org/drawingml/2006/picture">
+                <pic:pic xmlns:pic="http://schemas.openxmlformats.org/drawingml/2006/picture">
+                  <pic:nvPicPr>
+                    <pic:cNvPr id="0" name="" descr=""/>
+                    <pic:cNvPicPr>
+                      <a:picLocks noChangeAspect="1" noChangeArrowheads="1"/>
+                    </pic:cNvPicPr>
+                  </pic:nvPicPr>
+                  <pic:blipFill>
+                    <a:blip r:embed="rId42" cstate="none"/>
+                    <a:srcRect/>
+                    <a:stretch>
+                      <a:fillRect/>
+                    </a:stretch>
+                  </pic:blipFill>
+                  <pic:spPr bwMode="auto">
+                    <a:xfrm>
+                      <a:off x="0" y="0"/>
+                      <a:ext cx="6096000" cy="6981825"/>
+                    </a:xfrm>
+                    <a:prstGeom prst="rect">
+                      <a:avLst/>
+                    </a:prstGeom>
+                  </pic:spPr>
+                </pic:pic>
+              </a:graphicData>
+            </a:graphic>
+          </wp:inline>
+        </w:drawing>
+      </w:r>
+    </w:p>
+    <w:p>
+      <w:pPr>
+        <w:bidi/>
+        <w:spacing w:after="220" w:before="0"/>
+        <w:jc w:val="center"/>
+      </w:pPr>
+      <w:r>
+        <w:rPr>
+          <w:rFonts w:ascii="Arial" w:cs="Arial" w:eastAsia="Arial" w:hAnsi="Arial"/>
+          <w:b w:val="false"/>
+          <w:bCs w:val="false"/>
+          <w:i/>
+          <w:iCs/>
+          <w:color w:val="5B6670"/>
+          <w:sz w:val="17"/>
+          <w:szCs w:val="17"/>
+          <w:rtl/>
+        </w:rPr>
+        <w:t xml:space="preserve">شروط الاعتماد بالإنجليزية، الجزء الثاني</w:t>
+      </w:r>
+    </w:p>
+    <w:p>
+      <w:pPr>
+        <w:keepNext/>
+        <w:bidi/>
+        <w:spacing w:after="60" w:before="160"/>
+        <w:jc w:val="center"/>
+      </w:pPr>
+      <w:r>
+        <w:drawing>
+          <wp:inline distT="0" distB="0" distL="0" distR="0">
+            <wp:extent cx="6096000" cy="6981825"/>
+            <wp:effectExtent t="0" r="0" b="0" l="0"/>
+            <wp:docPr id="1" name="diagrams/screens/58-terms-en-3.png" descr="شروط الاعتماد بالإنجليزية، الجزء الثالث" title="شروط الاعتماد بالإنجليزية، الجزء الثالث"/>
+            <wp:cNvGraphicFramePr>
+              <a:graphicFrameLocks xmlns:a="http://schemas.openxmlformats.org/drawingml/2006/main" noChangeAspect="1"/>
+            </wp:cNvGraphicFramePr>
+            <a:graphic xmlns:a="http://schemas.openxmlformats.org/drawingml/2006/main">
+              <a:graphicData uri="http://schemas.openxmlformats.org/drawingml/2006/picture">
+                <pic:pic xmlns:pic="http://schemas.openxmlformats.org/drawingml/2006/picture">
+                  <pic:nvPicPr>
+                    <pic:cNvPr id="0" name="" descr=""/>
+                    <pic:cNvPicPr>
+                      <a:picLocks noChangeAspect="1" noChangeArrowheads="1"/>
+                    </pic:cNvPicPr>
+                  </pic:nvPicPr>
+                  <pic:blipFill>
+                    <a:blip r:embed="rId43" cstate="none"/>
+                    <a:srcRect/>
+                    <a:stretch>
+                      <a:fillRect/>
+                    </a:stretch>
+                  </pic:blipFill>
+                  <pic:spPr bwMode="auto">
+                    <a:xfrm>
+                      <a:off x="0" y="0"/>
+                      <a:ext cx="6096000" cy="6981825"/>
+                    </a:xfrm>
+                    <a:prstGeom prst="rect">
+                      <a:avLst/>
+                    </a:prstGeom>
+                  </pic:spPr>
+                </pic:pic>
+              </a:graphicData>
+            </a:graphic>
+          </wp:inline>
+        </w:drawing>
+      </w:r>
+    </w:p>
+    <w:p>
+      <w:pPr>
+        <w:bidi/>
+        <w:spacing w:after="220" w:before="0"/>
+        <w:jc w:val="center"/>
+      </w:pPr>
+      <w:r>
+        <w:rPr>
+          <w:rFonts w:ascii="Arial" w:cs="Arial" w:eastAsia="Arial" w:hAnsi="Arial"/>
+          <w:b w:val="false"/>
+          <w:bCs w:val="false"/>
+          <w:i/>
+          <w:iCs/>
+          <w:color w:val="5B6670"/>
+          <w:sz w:val="17"/>
+          <w:szCs w:val="17"/>
+          <w:rtl/>
+        </w:rPr>
+        <w:t xml:space="preserve">شروط الاعتماد بالإنجليزية، الجزء الثالث</w:t>
+      </w:r>
+    </w:p>
+    <w:p>
+      <w:pPr>
+        <w:keepNext/>
+        <w:bidi/>
+        <w:spacing w:after="60" w:before="160"/>
+        <w:jc w:val="center"/>
+      </w:pPr>
+      <w:r>
+        <w:drawing>
+          <wp:inline distT="0" distB="0" distL="0" distR="0">
+            <wp:extent cx="6096000" cy="3810000"/>
+            <wp:effectExtent t="0" r="0" b="0" l="0"/>
+            <wp:docPr id="1" name="diagrams/screens/57-terms-print-en.png" descr="الشروط المطبوعة بالإنجليزية" title="الشروط المطبوعة بالإنجليزية"/>
+            <wp:cNvGraphicFramePr>
+              <a:graphicFrameLocks xmlns:a="http://schemas.openxmlformats.org/drawingml/2006/main" noChangeAspect="1"/>
+            </wp:cNvGraphicFramePr>
+            <a:graphic xmlns:a="http://schemas.openxmlformats.org/drawingml/2006/main">
+              <a:graphicData uri="http://schemas.openxmlformats.org/drawingml/2006/picture">
+                <pic:pic xmlns:pic="http://schemas.openxmlformats.org/drawingml/2006/picture">
+                  <pic:nvPicPr>
+                    <pic:cNvPr id="0" name="" descr=""/>
+                    <pic:cNvPicPr>
+                      <a:picLocks noChangeAspect="1" noChangeArrowheads="1"/>
+                    </pic:cNvPicPr>
+                  </pic:nvPicPr>
+                  <pic:blipFill>
+                    <a:blip r:embed="rId44" cstate="none"/>
+                    <a:srcRect/>
+                    <a:stretch>
+                      <a:fillRect/>
+                    </a:stretch>
+                  </pic:blipFill>
+                  <pic:spPr bwMode="auto">
+                    <a:xfrm>
+                      <a:off x="0" y="0"/>
+                      <a:ext cx="6096000" cy="3810000"/>
+                    </a:xfrm>
+                    <a:prstGeom prst="rect">
+                      <a:avLst/>
+                    </a:prstGeom>
+                  </pic:spPr>
+                </pic:pic>
+              </a:graphicData>
+            </a:graphic>
+          </wp:inline>
+        </w:drawing>
+      </w:r>
+    </w:p>
+    <w:p>
+      <w:pPr>
+        <w:bidi/>
+        <w:spacing w:after="220" w:before="0"/>
+        <w:jc w:val="center"/>
+      </w:pPr>
+      <w:r>
+        <w:rPr>
+          <w:rFonts w:ascii="Arial" w:cs="Arial" w:eastAsia="Arial" w:hAnsi="Arial"/>
+          <w:b w:val="false"/>
+          <w:bCs w:val="false"/>
+          <w:i/>
+          <w:iCs/>
+          <w:color w:val="5B6670"/>
+          <w:sz w:val="17"/>
+          <w:szCs w:val="17"/>
+          <w:rtl/>
+        </w:rPr>
+        <w:t xml:space="preserve">الشروط المطبوعة بالإنجليزية</w:t>
+      </w:r>
+    </w:p>
+    <w:p>
+      <w:pPr>
+        <w:pStyle w:val="Heading2"/>
+        <w:bidi/>
+      </w:pPr>
+      <w:bookmarkStart w:name="_sec34" w:id="34"/>
+      <w:r>
+        <w:rPr>
+          <w:rFonts w:ascii="Arial" w:cs="Arial" w:eastAsia="Arial" w:hAnsi="Arial"/>
+          <w:b/>
+          <w:bCs/>
+          <w:color w:val="2B5C8A"/>
+          <w:sz w:val="26"/>
+          <w:szCs w:val="26"/>
+          <w:rtl/>
+        </w:rPr>
+        <w:t xml:space="preserve">ملاحظات ظهرت في اللقطات</w:t>
+      </w:r>
+      <w:bookmarkEnd w:id="34"/>
+    </w:p>
+    <w:p>
+      <w:pPr>
+        <w:pStyle w:val="ListParagraph"/>
+        <w:numPr>
+          <w:ilvl w:val="0"/>
+          <w:numId w:val="2"/>
+        </w:numPr>
+        <w:bidi/>
+        <w:spacing w:after="70" w:before="0" w:line="300"/>
+      </w:pPr>
+      <w:r>
+        <w:rPr>
+          <w:rFonts w:ascii="Arial" w:cs="Arial" w:eastAsia="Arial" w:hAnsi="Arial"/>
           <w:b/>
           <w:bCs/>
           <w:sz w:val="21"/>
@@ -4245,7 +4654,7 @@
           <w:szCs w:val="21"/>
           <w:rtl/>
         </w:rPr>
-        <w:t xml:space="preserve">قيم القوائم في الشاشة.</w:t>
+        <w:t xml:space="preserve">قيم القوائم في الشاشة العربية.</w:t>
       </w:r>
     </w:p>
     <w:p>
@@ -4267,7 +4676,7 @@
           <w:szCs w:val="21"/>
           <w:rtl/>
         </w:rPr>
-        <w:t xml:space="preserve">عناوين المطبوع وقيمه وحالته، فصارت كلها بالعربية.</w:t>
+        <w:t xml:space="preserve">عناوين المطبوع وقيمه وحالته.</w:t>
       </w:r>
     </w:p>
     <w:p>
@@ -4289,18 +4698,62 @@
           <w:szCs w:val="21"/>
           <w:rtl/>
         </w:rPr>
-        <w:t xml:space="preserve">بقي:</w:t>
-      </w:r>
-      <w:r>
-        <w:rPr>
-          <w:rFonts w:ascii="Arial" w:cs="Arial" w:eastAsia="Arial" w:hAnsi="Arial"/>
-          <w:b w:val="false"/>
-          <w:bCs w:val="false"/>
-          <w:sz w:val="21"/>
-          <w:szCs w:val="21"/>
-          <w:rtl/>
-        </w:rPr>
-        <w:t xml:space="preserve"> تصنيف البضاعة يُطبع برمزه من الكتالوج، مثل </w:t>
+        <w:t xml:space="preserve">صُحّح في 1.0.4:</w:t>
+      </w:r>
+      <w:r>
+        <w:rPr>
+          <w:rFonts w:ascii="Arial" w:cs="Arial" w:eastAsia="Arial" w:hAnsi="Arial"/>
+          <w:b w:val="false"/>
+          <w:bCs w:val="false"/>
+          <w:sz w:val="21"/>
+          <w:szCs w:val="21"/>
+          <w:rtl/>
+        </w:rPr>
+        <w:t xml:space="preserve"> تصنيف البضاعة صار يظهر باسمه بدل رمزه.</w:t>
+      </w:r>
+    </w:p>
+    <w:p>
+      <w:pPr>
+        <w:pStyle w:val="ListParagraph"/>
+        <w:numPr>
+          <w:ilvl w:val="0"/>
+          <w:numId w:val="2"/>
+        </w:numPr>
+        <w:bidi/>
+        <w:spacing w:after="70" w:before="0" w:line="300"/>
+      </w:pPr>
+      <w:r>
+        <w:rPr>
+          <w:rFonts w:ascii="Arial" w:cs="Arial" w:eastAsia="Arial" w:hAnsi="Arial"/>
+          <w:b/>
+          <w:bCs/>
+          <w:sz w:val="21"/>
+          <w:szCs w:val="21"/>
+          <w:rtl/>
+        </w:rPr>
+        <w:t xml:space="preserve">صُحّح بعد 1.0.4، ويدخل في 1.0.5:</w:t>
+      </w:r>
+    </w:p>
+    <w:p>
+      <w:pPr>
+        <w:pStyle w:val="ListParagraph"/>
+        <w:numPr>
+          <w:ilvl w:val="1"/>
+          <w:numId w:val="2"/>
+        </w:numPr>
+        <w:bidi/>
+        <w:spacing w:after="70" w:before="0" w:line="300"/>
+      </w:pPr>
+      <w:r>
+        <w:rPr>
+          <w:rFonts w:ascii="Arial" w:cs="Arial" w:eastAsia="Arial" w:hAnsi="Arial"/>
+          <w:b w:val="false"/>
+          <w:bCs w:val="false"/>
+          <w:sz w:val="21"/>
+          <w:szCs w:val="21"/>
+          <w:rtl/>
+        </w:rPr>
+        <w:t xml:space="preserve">قيم القوائم في الشاشة الإنجليزية، وكانت رموزًا مثل </w:t>
       </w:r>
       <w:r>
         <w:rPr>
@@ -4313,7 +4766,7 @@
           <w:shd w:fill="F1F3F5" w:color="auto" w:val="clear"/>
           <w:rtl/>
         </w:rPr>
-        <w:t xml:space="preserve">‎STEEL_PIPES‎</w:t>
+        <w:t xml:space="preserve">‎ABSOLUTE‎</w:t>
       </w:r>
       <w:r>
         <w:rPr>
@@ -4325,6 +4778,28 @@
           <w:rtl/>
         </w:rPr>
         <w:t xml:space="preserve">.</w:t>
+      </w:r>
+    </w:p>
+    <w:p>
+      <w:pPr>
+        <w:pStyle w:val="ListParagraph"/>
+        <w:numPr>
+          <w:ilvl w:val="1"/>
+          <w:numId w:val="2"/>
+        </w:numPr>
+        <w:bidi/>
+        <w:spacing w:after="70" w:before="0" w:line="300"/>
+      </w:pPr>
+      <w:r>
+        <w:rPr>
+          <w:rFonts w:ascii="Arial" w:cs="Arial" w:eastAsia="Arial" w:hAnsi="Arial"/>
+          <w:b w:val="false"/>
+          <w:bCs w:val="false"/>
+          <w:sz w:val="21"/>
+          <w:szCs w:val="21"/>
+          <w:rtl/>
+        </w:rPr>
+        <w:t xml:space="preserve">عناوين مربعات النص صارت بحجم باقي العناوين.</w:t>
       </w:r>
     </w:p>
     <w:p>

</xml_diff>

<commit_message>
Screenshots of the screens in English, the default (docs/59 section 5)
Co-Authored-By: Claude Opus 5.5 <noreply@anthropic.com>
Claude-Session: https://claude.ai/code/session_012HHcRrzuvMBTL2FYxXtsyv
</commit_message>
<xml_diff>
--- a/treasury-platform/docs/59-SYSTEM-SCREENS.docx
+++ b/treasury-platform/docs/59-SYSTEM-SCREENS.docx
@@ -104,6 +104,27 @@
             <w:rtl/>
           </w:rPr>
           <w:t xml:space="preserve">4. طلب اعتماد مستندي للمشتريات</w:t>
+        </w:r>
+      </w:hyperlink>
+    </w:p>
+    <w:p>
+      <w:pPr>
+        <w:bidi/>
+        <w:spacing w:after="50" w:before="0"/>
+        <w:ind w:left="0"/>
+      </w:pPr>
+      <w:hyperlink w:history="1" w:anchor="_sec35">
+        <w:r>
+          <w:rPr>
+            <w:rFonts w:ascii="Arial" w:cs="Arial" w:eastAsia="Arial" w:hAnsi="Arial"/>
+            <w:b/>
+            <w:bCs/>
+            <w:color w:val="1F3A5F"/>
+            <w:sz w:val="20"/>
+            <w:szCs w:val="20"/>
+            <w:rtl/>
+          </w:rPr>
+          <w:t xml:space="preserve">5. الشاشات بالإنجليزية، اللغة الافتراضية</w:t>
         </w:r>
       </w:hyperlink>
     </w:p>
@@ -4800,6 +4821,815 @@
           <w:rtl/>
         </w:rPr>
         <w:t xml:space="preserve">عناوين مربعات النص صارت بحجم باقي العناوين.</w:t>
+      </w:r>
+    </w:p>
+    <w:p>
+      <w:pPr>
+        <w:bidi/>
+        <w:spacing w:after="60" w:before="0"/>
+      </w:pPr>
+    </w:p>
+    <w:p>
+      <w:pPr>
+        <w:pStyle w:val="Heading1"/>
+        <w:bidi/>
+      </w:pPr>
+      <w:bookmarkStart w:name="_sec35" w:id="35"/>
+      <w:r>
+        <w:rPr>
+          <w:rFonts w:ascii="Arial" w:cs="Arial" w:eastAsia="Arial" w:hAnsi="Arial"/>
+          <w:b/>
+          <w:bCs/>
+          <w:color w:val="1F3A5F"/>
+          <w:sz w:val="32"/>
+          <w:szCs w:val="32"/>
+          <w:rtl/>
+        </w:rPr>
+        <w:t xml:space="preserve">5. الشاشات بالإنجليزية، اللغة الافتراضية</w:t>
+      </w:r>
+      <w:bookmarkEnd w:id="35"/>
+    </w:p>
+    <w:p>
+      <w:pPr>
+        <w:bidi/>
+        <w:spacing w:after="110" w:before="0" w:line="312"/>
+      </w:pPr>
+      <w:r>
+        <w:rPr>
+          <w:rFonts w:ascii="Arial" w:cs="Arial" w:eastAsia="Arial" w:hAnsi="Arial"/>
+          <w:b w:val="false"/>
+          <w:bCs w:val="false"/>
+          <w:sz w:val="21"/>
+          <w:szCs w:val="21"/>
+          <w:rtl/>
+        </w:rPr>
+        <w:t xml:space="preserve">طلب المالك: «اعطني صور الشاشات بالإنجليزي». أُخذت من الرحلة نفسها قبل التحويل إلى العربية. والصور في المجلد </w:t>
+      </w:r>
+      <w:r>
+        <w:rPr>
+          <w:rFonts w:ascii="Courier New" w:cs="Courier New" w:eastAsia="Courier New" w:hAnsi="Courier New"/>
+          <w:b w:val="false"/>
+          <w:bCs w:val="false"/>
+          <w:color w:val="1F2937"/>
+          <w:sz w:val="18"/>
+          <w:szCs w:val="18"/>
+          <w:shd w:fill="F1F3F5" w:color="auto" w:val="clear"/>
+          <w:rtl/>
+        </w:rPr>
+        <w:t xml:space="preserve">‎diagrams/screens/en/‎</w:t>
+      </w:r>
+      <w:r>
+        <w:rPr>
+          <w:rFonts w:ascii="Arial" w:cs="Arial" w:eastAsia="Arial" w:hAnsi="Arial"/>
+          <w:b w:val="false"/>
+          <w:bCs w:val="false"/>
+          <w:sz w:val="21"/>
+          <w:szCs w:val="21"/>
+          <w:rtl/>
+        </w:rPr>
+        <w:t xml:space="preserve">، وتشمل:</w:t>
+      </w:r>
+    </w:p>
+    <w:p>
+      <w:pPr>
+        <w:pStyle w:val="ListParagraph"/>
+        <w:numPr>
+          <w:ilvl w:val="0"/>
+          <w:numId w:val="2"/>
+        </w:numPr>
+        <w:bidi/>
+        <w:spacing w:after="70" w:before="0" w:line="300"/>
+      </w:pPr>
+      <w:r>
+        <w:rPr>
+          <w:rFonts w:ascii="Arial" w:cs="Arial" w:eastAsia="Arial" w:hAnsi="Arial"/>
+          <w:b/>
+          <w:bCs/>
+          <w:sz w:val="21"/>
+          <w:szCs w:val="21"/>
+          <w:rtl/>
+        </w:rPr>
+        <w:t xml:space="preserve">شاشات الإدارة:</w:t>
+      </w:r>
+      <w:r>
+        <w:rPr>
+          <w:rFonts w:ascii="Arial" w:cs="Arial" w:eastAsia="Arial" w:hAnsi="Arial"/>
+          <w:b w:val="false"/>
+          <w:bCs w:val="false"/>
+          <w:sz w:val="21"/>
+          <w:szCs w:val="21"/>
+          <w:rtl/>
+        </w:rPr>
+        <w:t xml:space="preserve"> 20 إلى 32.</w:t>
+      </w:r>
+    </w:p>
+    <w:p>
+      <w:pPr>
+        <w:pStyle w:val="ListParagraph"/>
+        <w:numPr>
+          <w:ilvl w:val="0"/>
+          <w:numId w:val="2"/>
+        </w:numPr>
+        <w:bidi/>
+        <w:spacing w:after="70" w:before="0" w:line="300"/>
+      </w:pPr>
+      <w:r>
+        <w:rPr>
+          <w:rFonts w:ascii="Arial" w:cs="Arial" w:eastAsia="Arial" w:hAnsi="Arial"/>
+          <w:b/>
+          <w:bCs/>
+          <w:sz w:val="21"/>
+          <w:szCs w:val="21"/>
+          <w:rtl/>
+        </w:rPr>
+        <w:t xml:space="preserve">التسهيلات:</w:t>
+      </w:r>
+      <w:r>
+        <w:rPr>
+          <w:rFonts w:ascii="Arial" w:cs="Arial" w:eastAsia="Arial" w:hAnsi="Arial"/>
+          <w:b w:val="false"/>
+          <w:bCs w:val="false"/>
+          <w:sz w:val="21"/>
+          <w:szCs w:val="21"/>
+          <w:rtl/>
+        </w:rPr>
+        <w:t xml:space="preserve"> 40 إلى 45.</w:t>
+      </w:r>
+    </w:p>
+    <w:p>
+      <w:pPr>
+        <w:pStyle w:val="ListParagraph"/>
+        <w:numPr>
+          <w:ilvl w:val="0"/>
+          <w:numId w:val="2"/>
+        </w:numPr>
+        <w:bidi/>
+        <w:spacing w:after="70" w:before="0" w:line="300"/>
+      </w:pPr>
+      <w:r>
+        <w:rPr>
+          <w:rFonts w:ascii="Arial" w:cs="Arial" w:eastAsia="Arial" w:hAnsi="Arial"/>
+          <w:b/>
+          <w:bCs/>
+          <w:sz w:val="21"/>
+          <w:szCs w:val="21"/>
+          <w:rtl/>
+        </w:rPr>
+        <w:t xml:space="preserve">طلب الاعتماد:</w:t>
+      </w:r>
+      <w:r>
+        <w:rPr>
+          <w:rFonts w:ascii="Arial" w:cs="Arial" w:eastAsia="Arial" w:hAnsi="Arial"/>
+          <w:b w:val="false"/>
+          <w:bCs w:val="false"/>
+          <w:sz w:val="21"/>
+          <w:szCs w:val="21"/>
+          <w:rtl/>
+        </w:rPr>
+        <w:t xml:space="preserve"> 50 إلى 52.</w:t>
+      </w:r>
+    </w:p>
+    <w:p>
+      <w:pPr>
+        <w:bidi/>
+        <w:spacing w:after="60" w:before="0"/>
+      </w:pPr>
+    </w:p>
+    <w:p>
+      <w:pPr>
+        <w:keepNext/>
+        <w:bidi/>
+        <w:spacing w:after="60" w:before="160"/>
+        <w:jc w:val="center"/>
+      </w:pPr>
+      <w:r>
+        <w:drawing>
+          <wp:inline distT="0" distB="0" distL="0" distR="0">
+            <wp:extent cx="6096000" cy="3810000"/>
+            <wp:effectExtent t="0" r="0" b="0" l="0"/>
+            <wp:docPr id="1" name="diagrams/screens/en/20-home.png" descr="الصفحة الرئيسية بالإنجليزية" title="الصفحة الرئيسية بالإنجليزية"/>
+            <wp:cNvGraphicFramePr>
+              <a:graphicFrameLocks xmlns:a="http://schemas.openxmlformats.org/drawingml/2006/main" noChangeAspect="1"/>
+            </wp:cNvGraphicFramePr>
+            <a:graphic xmlns:a="http://schemas.openxmlformats.org/drawingml/2006/main">
+              <a:graphicData uri="http://schemas.openxmlformats.org/drawingml/2006/picture">
+                <pic:pic xmlns:pic="http://schemas.openxmlformats.org/drawingml/2006/picture">
+                  <pic:nvPicPr>
+                    <pic:cNvPr id="0" name="" descr=""/>
+                    <pic:cNvPicPr>
+                      <a:picLocks noChangeAspect="1" noChangeArrowheads="1"/>
+                    </pic:cNvPicPr>
+                  </pic:nvPicPr>
+                  <pic:blipFill>
+                    <a:blip r:embed="rId45" cstate="none"/>
+                    <a:srcRect/>
+                    <a:stretch>
+                      <a:fillRect/>
+                    </a:stretch>
+                  </pic:blipFill>
+                  <pic:spPr bwMode="auto">
+                    <a:xfrm>
+                      <a:off x="0" y="0"/>
+                      <a:ext cx="6096000" cy="3810000"/>
+                    </a:xfrm>
+                    <a:prstGeom prst="rect">
+                      <a:avLst/>
+                    </a:prstGeom>
+                  </pic:spPr>
+                </pic:pic>
+              </a:graphicData>
+            </a:graphic>
+          </wp:inline>
+        </w:drawing>
+      </w:r>
+    </w:p>
+    <w:p>
+      <w:pPr>
+        <w:bidi/>
+        <w:spacing w:after="220" w:before="0"/>
+        <w:jc w:val="center"/>
+      </w:pPr>
+      <w:r>
+        <w:rPr>
+          <w:rFonts w:ascii="Arial" w:cs="Arial" w:eastAsia="Arial" w:hAnsi="Arial"/>
+          <w:b w:val="false"/>
+          <w:bCs w:val="false"/>
+          <w:i/>
+          <w:iCs/>
+          <w:color w:val="5B6670"/>
+          <w:sz w:val="17"/>
+          <w:szCs w:val="17"/>
+          <w:rtl/>
+        </w:rPr>
+        <w:t xml:space="preserve">الصفحة الرئيسية بالإنجليزية</w:t>
+      </w:r>
+    </w:p>
+    <w:p>
+      <w:pPr>
+        <w:keepNext/>
+        <w:bidi/>
+        <w:spacing w:after="60" w:before="160"/>
+        <w:jc w:val="center"/>
+      </w:pPr>
+      <w:r>
+        <w:drawing>
+          <wp:inline distT="0" distB="0" distL="0" distR="0">
+            <wp:extent cx="6096000" cy="3810000"/>
+            <wp:effectExtent t="0" r="0" b="0" l="0"/>
+            <wp:docPr id="1" name="diagrams/screens/en/41-facility-card.png" descr="بطاقة التسهيل بالإنجليزية" title="بطاقة التسهيل بالإنجليزية"/>
+            <wp:cNvGraphicFramePr>
+              <a:graphicFrameLocks xmlns:a="http://schemas.openxmlformats.org/drawingml/2006/main" noChangeAspect="1"/>
+            </wp:cNvGraphicFramePr>
+            <a:graphic xmlns:a="http://schemas.openxmlformats.org/drawingml/2006/main">
+              <a:graphicData uri="http://schemas.openxmlformats.org/drawingml/2006/picture">
+                <pic:pic xmlns:pic="http://schemas.openxmlformats.org/drawingml/2006/picture">
+                  <pic:nvPicPr>
+                    <pic:cNvPr id="0" name="" descr=""/>
+                    <pic:cNvPicPr>
+                      <a:picLocks noChangeAspect="1" noChangeArrowheads="1"/>
+                    </pic:cNvPicPr>
+                  </pic:nvPicPr>
+                  <pic:blipFill>
+                    <a:blip r:embed="rId46" cstate="none"/>
+                    <a:srcRect/>
+                    <a:stretch>
+                      <a:fillRect/>
+                    </a:stretch>
+                  </pic:blipFill>
+                  <pic:spPr bwMode="auto">
+                    <a:xfrm>
+                      <a:off x="0" y="0"/>
+                      <a:ext cx="6096000" cy="3810000"/>
+                    </a:xfrm>
+                    <a:prstGeom prst="rect">
+                      <a:avLst/>
+                    </a:prstGeom>
+                  </pic:spPr>
+                </pic:pic>
+              </a:graphicData>
+            </a:graphic>
+          </wp:inline>
+        </w:drawing>
+      </w:r>
+    </w:p>
+    <w:p>
+      <w:pPr>
+        <w:bidi/>
+        <w:spacing w:after="220" w:before="0"/>
+        <w:jc w:val="center"/>
+      </w:pPr>
+      <w:r>
+        <w:rPr>
+          <w:rFonts w:ascii="Arial" w:cs="Arial" w:eastAsia="Arial" w:hAnsi="Arial"/>
+          <w:b w:val="false"/>
+          <w:bCs w:val="false"/>
+          <w:i/>
+          <w:iCs/>
+          <w:color w:val="5B6670"/>
+          <w:sz w:val="17"/>
+          <w:szCs w:val="17"/>
+          <w:rtl/>
+        </w:rPr>
+        <w:t xml:space="preserve">بطاقة التسهيل بالإنجليزية</w:t>
+      </w:r>
+    </w:p>
+    <w:p>
+      <w:pPr>
+        <w:keepNext/>
+        <w:bidi/>
+        <w:spacing w:after="60" w:before="160"/>
+        <w:jc w:val="center"/>
+      </w:pPr>
+      <w:r>
+        <w:drawing>
+          <wp:inline distT="0" distB="0" distL="0" distR="0">
+            <wp:extent cx="6096000" cy="7877175"/>
+            <wp:effectExtent t="0" r="0" b="0" l="0"/>
+            <wp:docPr id="1" name="diagrams/screens/en/42-facility-limits-use.png" descr="الحدود والاستخدام بالإنجليزية" title="الحدود والاستخدام بالإنجليزية"/>
+            <wp:cNvGraphicFramePr>
+              <a:graphicFrameLocks xmlns:a="http://schemas.openxmlformats.org/drawingml/2006/main" noChangeAspect="1"/>
+            </wp:cNvGraphicFramePr>
+            <a:graphic xmlns:a="http://schemas.openxmlformats.org/drawingml/2006/main">
+              <a:graphicData uri="http://schemas.openxmlformats.org/drawingml/2006/picture">
+                <pic:pic xmlns:pic="http://schemas.openxmlformats.org/drawingml/2006/picture">
+                  <pic:nvPicPr>
+                    <pic:cNvPr id="0" name="" descr=""/>
+                    <pic:cNvPicPr>
+                      <a:picLocks noChangeAspect="1" noChangeArrowheads="1"/>
+                    </pic:cNvPicPr>
+                  </pic:nvPicPr>
+                  <pic:blipFill>
+                    <a:blip r:embed="rId47" cstate="none"/>
+                    <a:srcRect/>
+                    <a:stretch>
+                      <a:fillRect/>
+                    </a:stretch>
+                  </pic:blipFill>
+                  <pic:spPr bwMode="auto">
+                    <a:xfrm>
+                      <a:off x="0" y="0"/>
+                      <a:ext cx="6096000" cy="7877175"/>
+                    </a:xfrm>
+                    <a:prstGeom prst="rect">
+                      <a:avLst/>
+                    </a:prstGeom>
+                  </pic:spPr>
+                </pic:pic>
+              </a:graphicData>
+            </a:graphic>
+          </wp:inline>
+        </w:drawing>
+      </w:r>
+    </w:p>
+    <w:p>
+      <w:pPr>
+        <w:bidi/>
+        <w:spacing w:after="220" w:before="0"/>
+        <w:jc w:val="center"/>
+      </w:pPr>
+      <w:r>
+        <w:rPr>
+          <w:rFonts w:ascii="Arial" w:cs="Arial" w:eastAsia="Arial" w:hAnsi="Arial"/>
+          <w:b w:val="false"/>
+          <w:bCs w:val="false"/>
+          <w:i/>
+          <w:iCs/>
+          <w:color w:val="5B6670"/>
+          <w:sz w:val="17"/>
+          <w:szCs w:val="17"/>
+          <w:rtl/>
+        </w:rPr>
+        <w:t xml:space="preserve">الحدود والاستخدام بالإنجليزية</w:t>
+      </w:r>
+    </w:p>
+    <w:p>
+      <w:pPr>
+        <w:keepNext/>
+        <w:bidi/>
+        <w:spacing w:after="60" w:before="160"/>
+        <w:jc w:val="center"/>
+      </w:pPr>
+      <w:r>
+        <w:drawing>
+          <wp:inline distT="0" distB="0" distL="0" distR="0">
+            <wp:extent cx="6096000" cy="3810000"/>
+            <wp:effectExtent t="0" r="0" b="0" l="0"/>
+            <wp:docPr id="1" name="diagrams/screens/en/52-terms.png" descr="شروط الاعتماد بالإنجليزية" title="شروط الاعتماد بالإنجليزية"/>
+            <wp:cNvGraphicFramePr>
+              <a:graphicFrameLocks xmlns:a="http://schemas.openxmlformats.org/drawingml/2006/main" noChangeAspect="1"/>
+            </wp:cNvGraphicFramePr>
+            <a:graphic xmlns:a="http://schemas.openxmlformats.org/drawingml/2006/main">
+              <a:graphicData uri="http://schemas.openxmlformats.org/drawingml/2006/picture">
+                <pic:pic xmlns:pic="http://schemas.openxmlformats.org/drawingml/2006/picture">
+                  <pic:nvPicPr>
+                    <pic:cNvPr id="0" name="" descr=""/>
+                    <pic:cNvPicPr>
+                      <a:picLocks noChangeAspect="1" noChangeArrowheads="1"/>
+                    </pic:cNvPicPr>
+                  </pic:nvPicPr>
+                  <pic:blipFill>
+                    <a:blip r:embed="rId48" cstate="none"/>
+                    <a:srcRect/>
+                    <a:stretch>
+                      <a:fillRect/>
+                    </a:stretch>
+                  </pic:blipFill>
+                  <pic:spPr bwMode="auto">
+                    <a:xfrm>
+                      <a:off x="0" y="0"/>
+                      <a:ext cx="6096000" cy="3810000"/>
+                    </a:xfrm>
+                    <a:prstGeom prst="rect">
+                      <a:avLst/>
+                    </a:prstGeom>
+                  </pic:spPr>
+                </pic:pic>
+              </a:graphicData>
+            </a:graphic>
+          </wp:inline>
+        </w:drawing>
+      </w:r>
+    </w:p>
+    <w:p>
+      <w:pPr>
+        <w:bidi/>
+        <w:spacing w:after="220" w:before="0"/>
+        <w:jc w:val="center"/>
+      </w:pPr>
+      <w:r>
+        <w:rPr>
+          <w:rFonts w:ascii="Arial" w:cs="Arial" w:eastAsia="Arial" w:hAnsi="Arial"/>
+          <w:b w:val="false"/>
+          <w:bCs w:val="false"/>
+          <w:i/>
+          <w:iCs/>
+          <w:color w:val="5B6670"/>
+          <w:sz w:val="17"/>
+          <w:szCs w:val="17"/>
+          <w:rtl/>
+        </w:rPr>
+        <w:t xml:space="preserve">شروط الاعتماد بالإنجليزية</w:t>
+      </w:r>
+    </w:p>
+    <w:p>
+      <w:pPr>
+        <w:bidi/>
+        <w:spacing w:after="110" w:before="0" w:line="312"/>
+      </w:pPr>
+      <w:r>
+        <w:rPr>
+          <w:rFonts w:ascii="Arial" w:cs="Arial" w:eastAsia="Arial" w:hAnsi="Arial"/>
+          <w:b/>
+          <w:bCs/>
+          <w:sz w:val="21"/>
+          <w:szCs w:val="21"/>
+          <w:rtl/>
+        </w:rPr>
+        <w:t xml:space="preserve">ملاحظات ظهرت في الصور الإنجليزية، ولم تُصلَح بعد:</w:t>
+      </w:r>
+    </w:p>
+    <w:p>
+      <w:pPr>
+        <w:pStyle w:val="ListParagraph"/>
+        <w:numPr>
+          <w:ilvl w:val="0"/>
+          <w:numId w:val="2"/>
+        </w:numPr>
+        <w:bidi/>
+        <w:spacing w:after="70" w:before="0" w:line="300"/>
+      </w:pPr>
+      <w:r>
+        <w:rPr>
+          <w:rFonts w:ascii="Arial" w:cs="Arial" w:eastAsia="Arial" w:hAnsi="Arial"/>
+          <w:b/>
+          <w:bCs/>
+          <w:sz w:val="21"/>
+          <w:szCs w:val="21"/>
+          <w:rtl/>
+        </w:rPr>
+        <w:t xml:space="preserve">رموز بلا كلمات</w:t>
+      </w:r>
+      <w:r>
+        <w:rPr>
+          <w:rFonts w:ascii="Arial" w:cs="Arial" w:eastAsia="Arial" w:hAnsi="Arial"/>
+          <w:b w:val="false"/>
+          <w:bCs w:val="false"/>
+          <w:sz w:val="21"/>
+          <w:szCs w:val="21"/>
+          <w:rtl/>
+        </w:rPr>
+        <w:t xml:space="preserve"> في بطاقة التسهيل وحدودها، مثل:</w:t>
+      </w:r>
+    </w:p>
+    <w:p>
+      <w:pPr>
+        <w:pStyle w:val="ListParagraph"/>
+        <w:numPr>
+          <w:ilvl w:val="1"/>
+          <w:numId w:val="2"/>
+        </w:numPr>
+        <w:bidi/>
+        <w:spacing w:after="70" w:before="0" w:line="300"/>
+      </w:pPr>
+      <w:r>
+        <w:rPr>
+          <w:rFonts w:ascii="Arial" w:cs="Arial" w:eastAsia="Arial" w:hAnsi="Arial"/>
+          <w:b w:val="false"/>
+          <w:bCs w:val="false"/>
+          <w:sz w:val="21"/>
+          <w:szCs w:val="21"/>
+          <w:rtl/>
+        </w:rPr>
+        <w:t xml:space="preserve">حالة التسهيل </w:t>
+      </w:r>
+      <w:r>
+        <w:rPr>
+          <w:rFonts w:ascii="Courier New" w:cs="Courier New" w:eastAsia="Courier New" w:hAnsi="Courier New"/>
+          <w:b w:val="false"/>
+          <w:bCs w:val="false"/>
+          <w:color w:val="1F2937"/>
+          <w:sz w:val="18"/>
+          <w:szCs w:val="18"/>
+          <w:shd w:fill="F1F3F5" w:color="auto" w:val="clear"/>
+          <w:rtl/>
+        </w:rPr>
+        <w:t xml:space="preserve">‎ACTIVE‎</w:t>
+      </w:r>
+      <w:r>
+        <w:rPr>
+          <w:rFonts w:ascii="Arial" w:cs="Arial" w:eastAsia="Arial" w:hAnsi="Arial"/>
+          <w:b w:val="false"/>
+          <w:bCs w:val="false"/>
+          <w:sz w:val="21"/>
+          <w:szCs w:val="21"/>
+          <w:rtl/>
+        </w:rPr>
+        <w:t xml:space="preserve"> و</w:t>
+      </w:r>
+      <w:r>
+        <w:rPr>
+          <w:rFonts w:ascii="Courier New" w:cs="Courier New" w:eastAsia="Courier New" w:hAnsi="Courier New"/>
+          <w:b w:val="false"/>
+          <w:bCs w:val="false"/>
+          <w:color w:val="1F2937"/>
+          <w:sz w:val="18"/>
+          <w:szCs w:val="18"/>
+          <w:shd w:fill="F1F3F5" w:color="auto" w:val="clear"/>
+          <w:rtl/>
+        </w:rPr>
+        <w:t xml:space="preserve">‎VALID‎</w:t>
+      </w:r>
+      <w:r>
+        <w:rPr>
+          <w:rFonts w:ascii="Arial" w:cs="Arial" w:eastAsia="Arial" w:hAnsi="Arial"/>
+          <w:b w:val="false"/>
+          <w:bCs w:val="false"/>
+          <w:sz w:val="21"/>
+          <w:szCs w:val="21"/>
+          <w:rtl/>
+        </w:rPr>
+        <w:t xml:space="preserve">.</w:t>
+      </w:r>
+    </w:p>
+    <w:p>
+      <w:pPr>
+        <w:pStyle w:val="ListParagraph"/>
+        <w:numPr>
+          <w:ilvl w:val="1"/>
+          <w:numId w:val="2"/>
+        </w:numPr>
+        <w:bidi/>
+        <w:spacing w:after="70" w:before="0" w:line="300"/>
+      </w:pPr>
+      <w:r>
+        <w:rPr>
+          <w:rFonts w:ascii="Arial" w:cs="Arial" w:eastAsia="Arial" w:hAnsi="Arial"/>
+          <w:b w:val="false"/>
+          <w:bCs w:val="false"/>
+          <w:sz w:val="21"/>
+          <w:szCs w:val="21"/>
+          <w:rtl/>
+        </w:rPr>
+        <w:t xml:space="preserve">دور البنك </w:t>
+      </w:r>
+      <w:r>
+        <w:rPr>
+          <w:rFonts w:ascii="Courier New" w:cs="Courier New" w:eastAsia="Courier New" w:hAnsi="Courier New"/>
+          <w:b w:val="false"/>
+          <w:bCs w:val="false"/>
+          <w:color w:val="1F2937"/>
+          <w:sz w:val="18"/>
+          <w:szCs w:val="18"/>
+          <w:shd w:fill="F1F3F5" w:color="auto" w:val="clear"/>
+          <w:rtl/>
+        </w:rPr>
+        <w:t xml:space="preserve">‎SOLE‎</w:t>
+      </w:r>
+      <w:r>
+        <w:rPr>
+          <w:rFonts w:ascii="Arial" w:cs="Arial" w:eastAsia="Arial" w:hAnsi="Arial"/>
+          <w:b w:val="false"/>
+          <w:bCs w:val="false"/>
+          <w:sz w:val="21"/>
+          <w:szCs w:val="21"/>
+          <w:rtl/>
+        </w:rPr>
+        <w:t xml:space="preserve">.</w:t>
+      </w:r>
+    </w:p>
+    <w:p>
+      <w:pPr>
+        <w:pStyle w:val="ListParagraph"/>
+        <w:numPr>
+          <w:ilvl w:val="1"/>
+          <w:numId w:val="2"/>
+        </w:numPr>
+        <w:bidi/>
+        <w:spacing w:after="70" w:before="0" w:line="300"/>
+      </w:pPr>
+      <w:r>
+        <w:rPr>
+          <w:rFonts w:ascii="Arial" w:cs="Arial" w:eastAsia="Arial" w:hAnsi="Arial"/>
+          <w:b w:val="false"/>
+          <w:bCs w:val="false"/>
+          <w:sz w:val="21"/>
+          <w:szCs w:val="21"/>
+          <w:rtl/>
+        </w:rPr>
+        <w:t xml:space="preserve">نوع الحد </w:t>
+      </w:r>
+      <w:r>
+        <w:rPr>
+          <w:rFonts w:ascii="Courier New" w:cs="Courier New" w:eastAsia="Courier New" w:hAnsi="Courier New"/>
+          <w:b w:val="false"/>
+          <w:bCs w:val="false"/>
+          <w:color w:val="1F2937"/>
+          <w:sz w:val="18"/>
+          <w:szCs w:val="18"/>
+          <w:shd w:fill="F1F3F5" w:color="auto" w:val="clear"/>
+          <w:rtl/>
+        </w:rPr>
+        <w:t xml:space="preserve">‎DOCUMENTARY_CREDITS‎</w:t>
+      </w:r>
+      <w:r>
+        <w:rPr>
+          <w:rFonts w:ascii="Arial" w:cs="Arial" w:eastAsia="Arial" w:hAnsi="Arial"/>
+          <w:b w:val="false"/>
+          <w:bCs w:val="false"/>
+          <w:sz w:val="21"/>
+          <w:szCs w:val="21"/>
+          <w:rtl/>
+        </w:rPr>
+        <w:t xml:space="preserve"> و</w:t>
+      </w:r>
+      <w:r>
+        <w:rPr>
+          <w:rFonts w:ascii="Courier New" w:cs="Courier New" w:eastAsia="Courier New" w:hAnsi="Courier New"/>
+          <w:b w:val="false"/>
+          <w:bCs w:val="false"/>
+          <w:color w:val="1F2937"/>
+          <w:sz w:val="18"/>
+          <w:szCs w:val="18"/>
+          <w:shd w:fill="F1F3F5" w:color="auto" w:val="clear"/>
+          <w:rtl/>
+        </w:rPr>
+        <w:t xml:space="preserve">‎TOTAL_FACILITY‎</w:t>
+      </w:r>
+      <w:r>
+        <w:rPr>
+          <w:rFonts w:ascii="Arial" w:cs="Arial" w:eastAsia="Arial" w:hAnsi="Arial"/>
+          <w:b w:val="false"/>
+          <w:bCs w:val="false"/>
+          <w:sz w:val="21"/>
+          <w:szCs w:val="21"/>
+          <w:rtl/>
+        </w:rPr>
+        <w:t xml:space="preserve">.</w:t>
+      </w:r>
+    </w:p>
+    <w:p>
+      <w:pPr>
+        <w:pStyle w:val="ListParagraph"/>
+        <w:numPr>
+          <w:ilvl w:val="1"/>
+          <w:numId w:val="2"/>
+        </w:numPr>
+        <w:bidi/>
+        <w:spacing w:after="70" w:before="0" w:line="300"/>
+      </w:pPr>
+      <w:r>
+        <w:rPr>
+          <w:rFonts w:ascii="Arial" w:cs="Arial" w:eastAsia="Arial" w:hAnsi="Arial"/>
+          <w:b w:val="false"/>
+          <w:bCs w:val="false"/>
+          <w:sz w:val="21"/>
+          <w:szCs w:val="21"/>
+          <w:rtl/>
+        </w:rPr>
+        <w:t xml:space="preserve">نمط التوزيع </w:t>
+      </w:r>
+      <w:r>
+        <w:rPr>
+          <w:rFonts w:ascii="Courier New" w:cs="Courier New" w:eastAsia="Courier New" w:hAnsi="Courier New"/>
+          <w:b w:val="false"/>
+          <w:bCs w:val="false"/>
+          <w:color w:val="1F2937"/>
+          <w:sz w:val="18"/>
+          <w:szCs w:val="18"/>
+          <w:shd w:fill="F1F3F5" w:color="auto" w:val="clear"/>
+          <w:rtl/>
+        </w:rPr>
+        <w:t xml:space="preserve">‎SHARED_CAP‎</w:t>
+      </w:r>
+      <w:r>
+        <w:rPr>
+          <w:rFonts w:ascii="Arial" w:cs="Arial" w:eastAsia="Arial" w:hAnsi="Arial"/>
+          <w:b w:val="false"/>
+          <w:bCs w:val="false"/>
+          <w:sz w:val="21"/>
+          <w:szCs w:val="21"/>
+          <w:rtl/>
+        </w:rPr>
+        <w:t xml:space="preserve">.</w:t>
+      </w:r>
+    </w:p>
+    <w:p>
+      <w:pPr>
+        <w:pStyle w:val="ListParagraph"/>
+        <w:numPr>
+          <w:ilvl w:val="1"/>
+          <w:numId w:val="2"/>
+        </w:numPr>
+        <w:bidi/>
+        <w:spacing w:after="70" w:before="0" w:line="300"/>
+      </w:pPr>
+      <w:r>
+        <w:rPr>
+          <w:rFonts w:ascii="Arial" w:cs="Arial" w:eastAsia="Arial" w:hAnsi="Arial"/>
+          <w:b w:val="false"/>
+          <w:bCs w:val="false"/>
+          <w:sz w:val="21"/>
+          <w:szCs w:val="21"/>
+          <w:rtl/>
+        </w:rPr>
+        <w:t xml:space="preserve">رمز المنتج </w:t>
+      </w:r>
+      <w:r>
+        <w:rPr>
+          <w:rFonts w:ascii="Courier New" w:cs="Courier New" w:eastAsia="Courier New" w:hAnsi="Courier New"/>
+          <w:b w:val="false"/>
+          <w:bCs w:val="false"/>
+          <w:color w:val="1F2937"/>
+          <w:sz w:val="18"/>
+          <w:szCs w:val="18"/>
+          <w:shd w:fill="F1F3F5" w:color="auto" w:val="clear"/>
+          <w:rtl/>
+        </w:rPr>
+        <w:t xml:space="preserve">‎LC_PURCHASE_CONV‎</w:t>
+      </w:r>
+      <w:r>
+        <w:rPr>
+          <w:rFonts w:ascii="Arial" w:cs="Arial" w:eastAsia="Arial" w:hAnsi="Arial"/>
+          <w:b w:val="false"/>
+          <w:bCs w:val="false"/>
+          <w:sz w:val="21"/>
+          <w:szCs w:val="21"/>
+          <w:rtl/>
+        </w:rPr>
+        <w:t xml:space="preserve">.</w:t>
+      </w:r>
+    </w:p>
+    <w:p>
+      <w:pPr>
+        <w:pStyle w:val="ListParagraph"/>
+        <w:numPr>
+          <w:ilvl w:val="0"/>
+          <w:numId w:val="2"/>
+        </w:numPr>
+        <w:bidi/>
+        <w:spacing w:after="70" w:before="0" w:line="300"/>
+      </w:pPr>
+      <w:r>
+        <w:rPr>
+          <w:rFonts w:ascii="Arial" w:cs="Arial" w:eastAsia="Arial" w:hAnsi="Arial"/>
+          <w:b/>
+          <w:bCs/>
+          <w:sz w:val="21"/>
+          <w:szCs w:val="21"/>
+          <w:rtl/>
+        </w:rPr>
+        <w:t xml:space="preserve">اسم البنك</w:t>
+      </w:r>
+      <w:r>
+        <w:rPr>
+          <w:rFonts w:ascii="Arial" w:cs="Arial" w:eastAsia="Arial" w:hAnsi="Arial"/>
+          <w:b w:val="false"/>
+          <w:bCs w:val="false"/>
+          <w:sz w:val="21"/>
+          <w:szCs w:val="21"/>
+          <w:rtl/>
+        </w:rPr>
+        <w:t xml:space="preserve"> يظهر بالعربية «البنك الأول»، لأن البنك في الرحلة أُدخل باسم عربي فقط. والشاشة تعرض الاسم الإنجليزي حين يوجد.</w:t>
       </w:r>
     </w:p>
     <w:p>

</xml_diff>